<commit_message>
Preserve old links and redirect to corrected edition
</commit_message>
<xml_diff>
--- a/arhitektura-budushchego.docx
+++ b/arhitektura-budushchego.docx
@@ -104,97 +104,99 @@
           <w:lang w:val="ru-RU"/>
         </w:rPr>
       </w:pPr>
-      <w:hyperlink w:anchor="chapter_1">
-        <w:r>
-          <w:rPr>
-            <w:rFonts w:ascii="DejaVu Serif" w:hAnsi="DejaVu Serif"/>
-            <w:color w:val="000000"/>
-            <w:sz w:val="24"/>
-            <w:lang w:val="ru-RU"/>
-            <w:lang w:val="ru-RU"/>
-          </w:rPr>
-          <w:t xml:space="preserve">Глава </w:t>
-        </w:r>
-        <w:r>
-          <w:rPr>
-            <w:rFonts w:ascii="DejaVu Serif" w:hAnsi="DejaVu Serif"/>
-            <w:color w:val="000000"/>
-            <w:sz w:val="24"/>
-            <w:lang w:val="ru-RU"/>
-            <w:lang w:val="ru-RU"/>
-          </w:rPr>
-          <w:t xml:space="preserve">1. </w:t>
-        </w:r>
-        <w:r>
-          <w:rPr>
-            <w:rFonts w:ascii="DejaVu Serif" w:hAnsi="DejaVu Serif"/>
-            <w:color w:val="000000"/>
-            <w:sz w:val="24"/>
-            <w:lang w:val="ru-RU"/>
-            <w:lang w:val="ru-RU"/>
-          </w:rPr>
-          <w:t xml:space="preserve">В </w:t>
-        </w:r>
-        <w:r>
-          <w:rPr>
-            <w:rFonts w:ascii="DejaVu Serif" w:hAnsi="DejaVu Serif"/>
-            <w:color w:val="000000"/>
-            <w:sz w:val="24"/>
-            <w:lang w:val="ru-RU"/>
-            <w:lang w:val="ru-RU"/>
-          </w:rPr>
-          <w:t xml:space="preserve">какой </w:t>
-        </w:r>
-        <w:r>
-          <w:rPr>
-            <w:rFonts w:ascii="DejaVu Serif" w:hAnsi="DejaVu Serif"/>
-            <w:color w:val="000000"/>
-            <w:sz w:val="24"/>
-            <w:lang w:val="ru-RU"/>
-            <w:lang w:val="ru-RU"/>
-          </w:rPr>
-          <w:t xml:space="preserve">стране </w:t>
-        </w:r>
-        <w:r>
-          <w:rPr>
-            <w:rFonts w:ascii="DejaVu Serif" w:hAnsi="DejaVu Serif"/>
-            <w:color w:val="000000"/>
-            <w:sz w:val="24"/>
-            <w:lang w:val="ru-RU"/>
-            <w:lang w:val="ru-RU"/>
-          </w:rPr>
-          <w:t xml:space="preserve">будут </w:t>
-        </w:r>
-        <w:r>
-          <w:rPr>
-            <w:rFonts w:ascii="DejaVu Serif" w:hAnsi="DejaVu Serif"/>
-            <w:color w:val="000000"/>
-            <w:sz w:val="24"/>
-            <w:lang w:val="ru-RU"/>
-            <w:lang w:val="ru-RU"/>
-          </w:rPr>
-          <w:t xml:space="preserve">жить </w:t>
-        </w:r>
-        <w:r>
-          <w:rPr>
-            <w:rFonts w:ascii="DejaVu Serif" w:hAnsi="DejaVu Serif"/>
-            <w:color w:val="000000"/>
-            <w:sz w:val="24"/>
-            <w:lang w:val="ru-RU"/>
-            <w:lang w:val="ru-RU"/>
-          </w:rPr>
-          <w:t xml:space="preserve">наши </w:t>
-        </w:r>
-        <w:r>
-          <w:rPr>
-            <w:rFonts w:ascii="DejaVu Serif" w:hAnsi="DejaVu Serif"/>
-            <w:color w:val="000000"/>
-            <w:sz w:val="24"/>
-            <w:lang w:val="ru-RU"/>
-            <w:lang w:val="ru-RU"/>
-          </w:rPr>
-          <w:t>дети?</w:t>
-        </w:r>
+      <w:hyperlink w:anchor="chapter_1" w:history="1">
+        <w:hyperlink w:anchor="chapter_1">
+          <w:r>
+            <w:rPr>
+              <w:rFonts w:ascii="DejaVu Serif" w:hAnsi="DejaVu Serif"/>
+              <w:color w:val="000000"/>
+              <w:sz w:val="24"/>
+              <w:lang w:val="ru-RU"/>
+              <w:lang w:val="ru-RU"/>
+            </w:rPr>
+            <w:t xml:space="preserve">Глава </w:t>
+          </w:r>
+          <w:r>
+            <w:rPr>
+              <w:rFonts w:ascii="DejaVu Serif" w:hAnsi="DejaVu Serif"/>
+              <w:color w:val="000000"/>
+              <w:sz w:val="24"/>
+              <w:lang w:val="ru-RU"/>
+              <w:lang w:val="ru-RU"/>
+            </w:rPr>
+            <w:t xml:space="preserve">1. </w:t>
+          </w:r>
+          <w:r>
+            <w:rPr>
+              <w:rFonts w:ascii="DejaVu Serif" w:hAnsi="DejaVu Serif"/>
+              <w:color w:val="000000"/>
+              <w:sz w:val="24"/>
+              <w:lang w:val="ru-RU"/>
+              <w:lang w:val="ru-RU"/>
+            </w:rPr>
+            <w:t xml:space="preserve">В </w:t>
+          </w:r>
+          <w:r>
+            <w:rPr>
+              <w:rFonts w:ascii="DejaVu Serif" w:hAnsi="DejaVu Serif"/>
+              <w:color w:val="000000"/>
+              <w:sz w:val="24"/>
+              <w:lang w:val="ru-RU"/>
+              <w:lang w:val="ru-RU"/>
+            </w:rPr>
+            <w:t xml:space="preserve">какой </w:t>
+          </w:r>
+          <w:r>
+            <w:rPr>
+              <w:rFonts w:ascii="DejaVu Serif" w:hAnsi="DejaVu Serif"/>
+              <w:color w:val="000000"/>
+              <w:sz w:val="24"/>
+              <w:lang w:val="ru-RU"/>
+              <w:lang w:val="ru-RU"/>
+            </w:rPr>
+            <w:t xml:space="preserve">стране </w:t>
+          </w:r>
+          <w:r>
+            <w:rPr>
+              <w:rFonts w:ascii="DejaVu Serif" w:hAnsi="DejaVu Serif"/>
+              <w:color w:val="000000"/>
+              <w:sz w:val="24"/>
+              <w:lang w:val="ru-RU"/>
+              <w:lang w:val="ru-RU"/>
+            </w:rPr>
+            <w:t xml:space="preserve">будут </w:t>
+          </w:r>
+          <w:r>
+            <w:rPr>
+              <w:rFonts w:ascii="DejaVu Serif" w:hAnsi="DejaVu Serif"/>
+              <w:color w:val="000000"/>
+              <w:sz w:val="24"/>
+              <w:lang w:val="ru-RU"/>
+              <w:lang w:val="ru-RU"/>
+            </w:rPr>
+            <w:t xml:space="preserve">жить </w:t>
+          </w:r>
+          <w:r>
+            <w:rPr>
+              <w:rFonts w:ascii="DejaVu Serif" w:hAnsi="DejaVu Serif"/>
+              <w:color w:val="000000"/>
+              <w:sz w:val="24"/>
+              <w:lang w:val="ru-RU"/>
+              <w:lang w:val="ru-RU"/>
+            </w:rPr>
+            <w:t xml:space="preserve">наши </w:t>
+          </w:r>
+          <w:r>
+            <w:rPr>
+              <w:rFonts w:ascii="DejaVu Serif" w:hAnsi="DejaVu Serif"/>
+              <w:color w:val="000000"/>
+              <w:sz w:val="24"/>
+              <w:lang w:val="ru-RU"/>
+              <w:lang w:val="ru-RU"/>
+            </w:rPr>
+            <w:t>дети?</w:t>
+          </w:r>
+        </w:hyperlink>
       </w:hyperlink>
     </w:p>
     <w:p>
@@ -210,67 +212,69 @@
           <w:lang w:val="ru-RU"/>
         </w:rPr>
       </w:pPr>
-      <w:hyperlink w:anchor="chapter_2">
-        <w:r>
-          <w:rPr>
-            <w:rFonts w:ascii="DejaVu Serif" w:hAnsi="DejaVu Serif"/>
-            <w:color w:val="000000"/>
-            <w:sz w:val="24"/>
-            <w:lang w:val="ru-RU"/>
-            <w:lang w:val="ru-RU"/>
-          </w:rPr>
-          <w:t xml:space="preserve">Глава </w:t>
-        </w:r>
-        <w:r>
-          <w:rPr>
-            <w:rFonts w:ascii="DejaVu Serif" w:hAnsi="DejaVu Serif"/>
-            <w:color w:val="000000"/>
-            <w:sz w:val="24"/>
-            <w:lang w:val="ru-RU"/>
-            <w:lang w:val="ru-RU"/>
-          </w:rPr>
-          <w:t xml:space="preserve">2. </w:t>
-        </w:r>
-        <w:r>
-          <w:rPr>
-            <w:rFonts w:ascii="DejaVu Serif" w:hAnsi="DejaVu Serif"/>
-            <w:color w:val="000000"/>
-            <w:sz w:val="24"/>
-            <w:lang w:val="ru-RU"/>
-            <w:lang w:val="ru-RU"/>
-          </w:rPr>
-          <w:t xml:space="preserve">Бог, </w:t>
-        </w:r>
-        <w:r>
-          <w:rPr>
-            <w:rFonts w:ascii="DejaVu Serif" w:hAnsi="DejaVu Serif"/>
-            <w:color w:val="000000"/>
-            <w:sz w:val="24"/>
-            <w:lang w:val="ru-RU"/>
-            <w:lang w:val="ru-RU"/>
-          </w:rPr>
-          <w:t xml:space="preserve">любовь </w:t>
-        </w:r>
-        <w:r>
-          <w:rPr>
-            <w:rFonts w:ascii="DejaVu Serif" w:hAnsi="DejaVu Serif"/>
-            <w:color w:val="000000"/>
-            <w:sz w:val="24"/>
-            <w:lang w:val="ru-RU"/>
-            <w:lang w:val="ru-RU"/>
-          </w:rPr>
-          <w:t xml:space="preserve">и </w:t>
-        </w:r>
-        <w:r>
-          <w:rPr>
-            <w:rFonts w:ascii="DejaVu Serif" w:hAnsi="DejaVu Serif"/>
-            <w:color w:val="000000"/>
-            <w:sz w:val="24"/>
-            <w:lang w:val="ru-RU"/>
-            <w:lang w:val="ru-RU"/>
-          </w:rPr>
-          <w:t>справедливость</w:t>
-        </w:r>
+      <w:hyperlink w:anchor="chapter_2" w:history="1">
+        <w:hyperlink w:anchor="chapter_2">
+          <w:r>
+            <w:rPr>
+              <w:rFonts w:ascii="DejaVu Serif" w:hAnsi="DejaVu Serif"/>
+              <w:color w:val="000000"/>
+              <w:sz w:val="24"/>
+              <w:lang w:val="ru-RU"/>
+              <w:lang w:val="ru-RU"/>
+            </w:rPr>
+            <w:t xml:space="preserve">Глава </w:t>
+          </w:r>
+          <w:r>
+            <w:rPr>
+              <w:rFonts w:ascii="DejaVu Serif" w:hAnsi="DejaVu Serif"/>
+              <w:color w:val="000000"/>
+              <w:sz w:val="24"/>
+              <w:lang w:val="ru-RU"/>
+              <w:lang w:val="ru-RU"/>
+            </w:rPr>
+            <w:t xml:space="preserve">2. </w:t>
+          </w:r>
+          <w:r>
+            <w:rPr>
+              <w:rFonts w:ascii="DejaVu Serif" w:hAnsi="DejaVu Serif"/>
+              <w:color w:val="000000"/>
+              <w:sz w:val="24"/>
+              <w:lang w:val="ru-RU"/>
+              <w:lang w:val="ru-RU"/>
+            </w:rPr>
+            <w:t xml:space="preserve">Бог, </w:t>
+          </w:r>
+          <w:r>
+            <w:rPr>
+              <w:rFonts w:ascii="DejaVu Serif" w:hAnsi="DejaVu Serif"/>
+              <w:color w:val="000000"/>
+              <w:sz w:val="24"/>
+              <w:lang w:val="ru-RU"/>
+              <w:lang w:val="ru-RU"/>
+            </w:rPr>
+            <w:t xml:space="preserve">любовь </w:t>
+          </w:r>
+          <w:r>
+            <w:rPr>
+              <w:rFonts w:ascii="DejaVu Serif" w:hAnsi="DejaVu Serif"/>
+              <w:color w:val="000000"/>
+              <w:sz w:val="24"/>
+              <w:lang w:val="ru-RU"/>
+              <w:lang w:val="ru-RU"/>
+            </w:rPr>
+            <w:t xml:space="preserve">и </w:t>
+          </w:r>
+          <w:r>
+            <w:rPr>
+              <w:rFonts w:ascii="DejaVu Serif" w:hAnsi="DejaVu Serif"/>
+              <w:color w:val="000000"/>
+              <w:sz w:val="24"/>
+              <w:lang w:val="ru-RU"/>
+              <w:lang w:val="ru-RU"/>
+            </w:rPr>
+            <w:t>справедливость</w:t>
+          </w:r>
+        </w:hyperlink>
       </w:hyperlink>
     </w:p>
     <w:p>
@@ -286,77 +290,79 @@
           <w:lang w:val="ru-RU"/>
         </w:rPr>
       </w:pPr>
-      <w:hyperlink w:anchor="chapter_3">
-        <w:r>
-          <w:rPr>
-            <w:rFonts w:ascii="DejaVu Serif" w:hAnsi="DejaVu Serif"/>
-            <w:color w:val="000000"/>
-            <w:sz w:val="24"/>
-            <w:lang w:val="ru-RU"/>
-            <w:lang w:val="ru-RU"/>
-          </w:rPr>
-          <w:t xml:space="preserve">Глава </w:t>
-        </w:r>
-        <w:r>
-          <w:rPr>
-            <w:rFonts w:ascii="DejaVu Serif" w:hAnsi="DejaVu Serif"/>
-            <w:color w:val="000000"/>
-            <w:sz w:val="24"/>
-            <w:lang w:val="ru-RU"/>
-            <w:lang w:val="ru-RU"/>
-          </w:rPr>
-          <w:t xml:space="preserve">3. </w:t>
-        </w:r>
-        <w:r>
-          <w:rPr>
-            <w:rFonts w:ascii="DejaVu Serif" w:hAnsi="DejaVu Serif"/>
-            <w:color w:val="000000"/>
-            <w:sz w:val="24"/>
-            <w:lang w:val="ru-RU"/>
-            <w:lang w:val="ru-RU"/>
-          </w:rPr>
-          <w:t xml:space="preserve">Новый </w:t>
-        </w:r>
-        <w:r>
-          <w:rPr>
-            <w:rFonts w:ascii="DejaVu Serif" w:hAnsi="DejaVu Serif"/>
-            <w:color w:val="000000"/>
-            <w:sz w:val="24"/>
-            <w:lang w:val="ru-RU"/>
-            <w:lang w:val="ru-RU"/>
-          </w:rPr>
-          <w:t xml:space="preserve">человек </w:t>
-        </w:r>
-        <w:r>
-          <w:rPr>
-            <w:rFonts w:ascii="DejaVu Serif" w:hAnsi="DejaVu Serif"/>
-            <w:color w:val="000000"/>
-            <w:sz w:val="24"/>
-            <w:lang w:val="ru-RU"/>
-            <w:lang w:val="ru-RU"/>
-          </w:rPr>
-          <w:t xml:space="preserve">и </w:t>
-        </w:r>
-        <w:r>
-          <w:rPr>
-            <w:rFonts w:ascii="DejaVu Serif" w:hAnsi="DejaVu Serif"/>
-            <w:color w:val="000000"/>
-            <w:sz w:val="24"/>
-            <w:lang w:val="ru-RU"/>
-            <w:lang w:val="ru-RU"/>
-          </w:rPr>
-          <w:t xml:space="preserve">общество </w:t>
-        </w:r>
-        <w:r>
-          <w:rPr>
-            <w:rFonts w:ascii="DejaVu Serif" w:hAnsi="DejaVu Serif"/>
-            <w:color w:val="000000"/>
-            <w:sz w:val="24"/>
-            <w:lang w:val="ru-RU"/>
-            <w:lang w:val="ru-RU"/>
-          </w:rPr>
-          <w:t>любви</w:t>
-        </w:r>
+      <w:hyperlink w:anchor="chapter_3" w:history="1">
+        <w:hyperlink w:anchor="chapter_3">
+          <w:r>
+            <w:rPr>
+              <w:rFonts w:ascii="DejaVu Serif" w:hAnsi="DejaVu Serif"/>
+              <w:color w:val="000000"/>
+              <w:sz w:val="24"/>
+              <w:lang w:val="ru-RU"/>
+              <w:lang w:val="ru-RU"/>
+            </w:rPr>
+            <w:t xml:space="preserve">Глава </w:t>
+          </w:r>
+          <w:r>
+            <w:rPr>
+              <w:rFonts w:ascii="DejaVu Serif" w:hAnsi="DejaVu Serif"/>
+              <w:color w:val="000000"/>
+              <w:sz w:val="24"/>
+              <w:lang w:val="ru-RU"/>
+              <w:lang w:val="ru-RU"/>
+            </w:rPr>
+            <w:t xml:space="preserve">3. </w:t>
+          </w:r>
+          <w:r>
+            <w:rPr>
+              <w:rFonts w:ascii="DejaVu Serif" w:hAnsi="DejaVu Serif"/>
+              <w:color w:val="000000"/>
+              <w:sz w:val="24"/>
+              <w:lang w:val="ru-RU"/>
+              <w:lang w:val="ru-RU"/>
+            </w:rPr>
+            <w:t xml:space="preserve">Новый </w:t>
+          </w:r>
+          <w:r>
+            <w:rPr>
+              <w:rFonts w:ascii="DejaVu Serif" w:hAnsi="DejaVu Serif"/>
+              <w:color w:val="000000"/>
+              <w:sz w:val="24"/>
+              <w:lang w:val="ru-RU"/>
+              <w:lang w:val="ru-RU"/>
+            </w:rPr>
+            <w:t xml:space="preserve">человек </w:t>
+          </w:r>
+          <w:r>
+            <w:rPr>
+              <w:rFonts w:ascii="DejaVu Serif" w:hAnsi="DejaVu Serif"/>
+              <w:color w:val="000000"/>
+              <w:sz w:val="24"/>
+              <w:lang w:val="ru-RU"/>
+              <w:lang w:val="ru-RU"/>
+            </w:rPr>
+            <w:t xml:space="preserve">и </w:t>
+          </w:r>
+          <w:r>
+            <w:rPr>
+              <w:rFonts w:ascii="DejaVu Serif" w:hAnsi="DejaVu Serif"/>
+              <w:color w:val="000000"/>
+              <w:sz w:val="24"/>
+              <w:lang w:val="ru-RU"/>
+              <w:lang w:val="ru-RU"/>
+            </w:rPr>
+            <w:t xml:space="preserve">общество </w:t>
+          </w:r>
+          <w:r>
+            <w:rPr>
+              <w:rFonts w:ascii="DejaVu Serif" w:hAnsi="DejaVu Serif"/>
+              <w:color w:val="000000"/>
+              <w:sz w:val="24"/>
+              <w:lang w:val="ru-RU"/>
+              <w:lang w:val="ru-RU"/>
+            </w:rPr>
+            <w:t>любви</w:t>
+          </w:r>
+        </w:hyperlink>
       </w:hyperlink>
     </w:p>
     <w:p>
@@ -372,77 +378,79 @@
           <w:lang w:val="ru-RU"/>
         </w:rPr>
       </w:pPr>
-      <w:hyperlink w:anchor="chapter_4">
-        <w:r>
-          <w:rPr>
-            <w:rFonts w:ascii="DejaVu Serif" w:hAnsi="DejaVu Serif"/>
-            <w:color w:val="000000"/>
-            <w:sz w:val="24"/>
-            <w:lang w:val="ru-RU"/>
-            <w:lang w:val="ru-RU"/>
-          </w:rPr>
-          <w:t xml:space="preserve">Глава </w:t>
-        </w:r>
-        <w:r>
-          <w:rPr>
-            <w:rFonts w:ascii="DejaVu Serif" w:hAnsi="DejaVu Serif"/>
-            <w:color w:val="000000"/>
-            <w:sz w:val="24"/>
-            <w:lang w:val="ru-RU"/>
-            <w:lang w:val="ru-RU"/>
-          </w:rPr>
-          <w:t xml:space="preserve">4. </w:t>
-        </w:r>
-        <w:r>
-          <w:rPr>
-            <w:rFonts w:ascii="DejaVu Serif" w:hAnsi="DejaVu Serif"/>
-            <w:color w:val="000000"/>
-            <w:sz w:val="24"/>
-            <w:lang w:val="ru-RU"/>
-            <w:lang w:val="ru-RU"/>
-          </w:rPr>
-          <w:t xml:space="preserve">Церковь, </w:t>
-        </w:r>
-        <w:r>
-          <w:rPr>
-            <w:rFonts w:ascii="DejaVu Serif" w:hAnsi="DejaVu Serif"/>
-            <w:color w:val="000000"/>
-            <w:sz w:val="24"/>
-            <w:lang w:val="ru-RU"/>
-            <w:lang w:val="ru-RU"/>
-          </w:rPr>
-          <w:t xml:space="preserve">соборность </w:t>
-        </w:r>
-        <w:r>
-          <w:rPr>
-            <w:rFonts w:ascii="DejaVu Serif" w:hAnsi="DejaVu Serif"/>
-            <w:color w:val="000000"/>
-            <w:sz w:val="24"/>
-            <w:lang w:val="ru-RU"/>
-            <w:lang w:val="ru-RU"/>
-          </w:rPr>
-          <w:t xml:space="preserve">и </w:t>
-        </w:r>
-        <w:r>
-          <w:rPr>
-            <w:rFonts w:ascii="DejaVu Serif" w:hAnsi="DejaVu Serif"/>
-            <w:color w:val="000000"/>
-            <w:sz w:val="24"/>
-            <w:lang w:val="ru-RU"/>
-            <w:lang w:val="ru-RU"/>
-          </w:rPr>
-          <w:t xml:space="preserve">государственное </w:t>
-        </w:r>
-        <w:r>
-          <w:rPr>
-            <w:rFonts w:ascii="DejaVu Serif" w:hAnsi="DejaVu Serif"/>
-            <w:color w:val="000000"/>
-            <w:sz w:val="24"/>
-            <w:lang w:val="ru-RU"/>
-            <w:lang w:val="ru-RU"/>
-          </w:rPr>
-          <w:t>управление</w:t>
-        </w:r>
+      <w:hyperlink w:anchor="chapter_4" w:history="1">
+        <w:hyperlink w:anchor="chapter_4">
+          <w:r>
+            <w:rPr>
+              <w:rFonts w:ascii="DejaVu Serif" w:hAnsi="DejaVu Serif"/>
+              <w:color w:val="000000"/>
+              <w:sz w:val="24"/>
+              <w:lang w:val="ru-RU"/>
+              <w:lang w:val="ru-RU"/>
+            </w:rPr>
+            <w:t xml:space="preserve">Глава </w:t>
+          </w:r>
+          <w:r>
+            <w:rPr>
+              <w:rFonts w:ascii="DejaVu Serif" w:hAnsi="DejaVu Serif"/>
+              <w:color w:val="000000"/>
+              <w:sz w:val="24"/>
+              <w:lang w:val="ru-RU"/>
+              <w:lang w:val="ru-RU"/>
+            </w:rPr>
+            <w:t xml:space="preserve">4. </w:t>
+          </w:r>
+          <w:r>
+            <w:rPr>
+              <w:rFonts w:ascii="DejaVu Serif" w:hAnsi="DejaVu Serif"/>
+              <w:color w:val="000000"/>
+              <w:sz w:val="24"/>
+              <w:lang w:val="ru-RU"/>
+              <w:lang w:val="ru-RU"/>
+            </w:rPr>
+            <w:t xml:space="preserve">Церковь, </w:t>
+          </w:r>
+          <w:r>
+            <w:rPr>
+              <w:rFonts w:ascii="DejaVu Serif" w:hAnsi="DejaVu Serif"/>
+              <w:color w:val="000000"/>
+              <w:sz w:val="24"/>
+              <w:lang w:val="ru-RU"/>
+              <w:lang w:val="ru-RU"/>
+            </w:rPr>
+            <w:t xml:space="preserve">соборность </w:t>
+          </w:r>
+          <w:r>
+            <w:rPr>
+              <w:rFonts w:ascii="DejaVu Serif" w:hAnsi="DejaVu Serif"/>
+              <w:color w:val="000000"/>
+              <w:sz w:val="24"/>
+              <w:lang w:val="ru-RU"/>
+              <w:lang w:val="ru-RU"/>
+            </w:rPr>
+            <w:t xml:space="preserve">и </w:t>
+          </w:r>
+          <w:r>
+            <w:rPr>
+              <w:rFonts w:ascii="DejaVu Serif" w:hAnsi="DejaVu Serif"/>
+              <w:color w:val="000000"/>
+              <w:sz w:val="24"/>
+              <w:lang w:val="ru-RU"/>
+              <w:lang w:val="ru-RU"/>
+            </w:rPr>
+            <w:t xml:space="preserve">государственное </w:t>
+          </w:r>
+          <w:r>
+            <w:rPr>
+              <w:rFonts w:ascii="DejaVu Serif" w:hAnsi="DejaVu Serif"/>
+              <w:color w:val="000000"/>
+              <w:sz w:val="24"/>
+              <w:lang w:val="ru-RU"/>
+              <w:lang w:val="ru-RU"/>
+            </w:rPr>
+            <w:t>управление</w:t>
+          </w:r>
+        </w:hyperlink>
       </w:hyperlink>
     </w:p>
     <w:p>
@@ -458,77 +466,79 @@
           <w:lang w:val="ru-RU"/>
         </w:rPr>
       </w:pPr>
-      <w:hyperlink w:anchor="chapter_5">
-        <w:r>
-          <w:rPr>
-            <w:rFonts w:ascii="DejaVu Serif" w:hAnsi="DejaVu Serif"/>
-            <w:color w:val="000000"/>
-            <w:sz w:val="24"/>
-            <w:lang w:val="ru-RU"/>
-            <w:lang w:val="ru-RU"/>
-          </w:rPr>
-          <w:t xml:space="preserve">Глава </w:t>
-        </w:r>
-        <w:r>
-          <w:rPr>
-            <w:rFonts w:ascii="DejaVu Serif" w:hAnsi="DejaVu Serif"/>
-            <w:color w:val="000000"/>
-            <w:sz w:val="24"/>
-            <w:lang w:val="ru-RU"/>
-            <w:lang w:val="ru-RU"/>
-          </w:rPr>
-          <w:t xml:space="preserve">5. </w:t>
-        </w:r>
-        <w:r>
-          <w:rPr>
-            <w:rFonts w:ascii="DejaVu Serif" w:hAnsi="DejaVu Serif"/>
-            <w:color w:val="000000"/>
-            <w:sz w:val="24"/>
-            <w:lang w:val="ru-RU"/>
-            <w:lang w:val="ru-RU"/>
-          </w:rPr>
-          <w:t xml:space="preserve">Соборное </w:t>
-        </w:r>
-        <w:r>
-          <w:rPr>
-            <w:rFonts w:ascii="DejaVu Serif" w:hAnsi="DejaVu Serif"/>
-            <w:color w:val="000000"/>
-            <w:sz w:val="24"/>
-            <w:lang w:val="ru-RU"/>
-            <w:lang w:val="ru-RU"/>
-          </w:rPr>
-          <w:t xml:space="preserve">хозяйствование: </w:t>
-        </w:r>
-        <w:r>
-          <w:rPr>
-            <w:rFonts w:ascii="DejaVu Serif" w:hAnsi="DejaVu Serif"/>
-            <w:color w:val="000000"/>
-            <w:sz w:val="24"/>
-            <w:lang w:val="ru-RU"/>
-            <w:lang w:val="ru-RU"/>
-          </w:rPr>
-          <w:t xml:space="preserve">общество </w:t>
-        </w:r>
-        <w:r>
-          <w:rPr>
-            <w:rFonts w:ascii="DejaVu Serif" w:hAnsi="DejaVu Serif"/>
-            <w:color w:val="000000"/>
-            <w:sz w:val="24"/>
-            <w:lang w:val="ru-RU"/>
-            <w:lang w:val="ru-RU"/>
-          </w:rPr>
-          <w:t xml:space="preserve">без </w:t>
-        </w:r>
-        <w:r>
-          <w:rPr>
-            <w:rFonts w:ascii="DejaVu Serif" w:hAnsi="DejaVu Serif"/>
-            <w:color w:val="000000"/>
-            <w:sz w:val="24"/>
-            <w:lang w:val="ru-RU"/>
-            <w:lang w:val="ru-RU"/>
-          </w:rPr>
-          <w:t>денег</w:t>
-        </w:r>
+      <w:hyperlink w:anchor="chapter_5" w:history="1">
+        <w:hyperlink w:anchor="chapter_5">
+          <w:r>
+            <w:rPr>
+              <w:rFonts w:ascii="DejaVu Serif" w:hAnsi="DejaVu Serif"/>
+              <w:color w:val="000000"/>
+              <w:sz w:val="24"/>
+              <w:lang w:val="ru-RU"/>
+              <w:lang w:val="ru-RU"/>
+            </w:rPr>
+            <w:t xml:space="preserve">Глава </w:t>
+          </w:r>
+          <w:r>
+            <w:rPr>
+              <w:rFonts w:ascii="DejaVu Serif" w:hAnsi="DejaVu Serif"/>
+              <w:color w:val="000000"/>
+              <w:sz w:val="24"/>
+              <w:lang w:val="ru-RU"/>
+              <w:lang w:val="ru-RU"/>
+            </w:rPr>
+            <w:t xml:space="preserve">5. </w:t>
+          </w:r>
+          <w:r>
+            <w:rPr>
+              <w:rFonts w:ascii="DejaVu Serif" w:hAnsi="DejaVu Serif"/>
+              <w:color w:val="000000"/>
+              <w:sz w:val="24"/>
+              <w:lang w:val="ru-RU"/>
+              <w:lang w:val="ru-RU"/>
+            </w:rPr>
+            <w:t xml:space="preserve">Соборное </w:t>
+          </w:r>
+          <w:r>
+            <w:rPr>
+              <w:rFonts w:ascii="DejaVu Serif" w:hAnsi="DejaVu Serif"/>
+              <w:color w:val="000000"/>
+              <w:sz w:val="24"/>
+              <w:lang w:val="ru-RU"/>
+              <w:lang w:val="ru-RU"/>
+            </w:rPr>
+            <w:t xml:space="preserve">хозяйствование: </w:t>
+          </w:r>
+          <w:r>
+            <w:rPr>
+              <w:rFonts w:ascii="DejaVu Serif" w:hAnsi="DejaVu Serif"/>
+              <w:color w:val="000000"/>
+              <w:sz w:val="24"/>
+              <w:lang w:val="ru-RU"/>
+              <w:lang w:val="ru-RU"/>
+            </w:rPr>
+            <w:t xml:space="preserve">общество </w:t>
+          </w:r>
+          <w:r>
+            <w:rPr>
+              <w:rFonts w:ascii="DejaVu Serif" w:hAnsi="DejaVu Serif"/>
+              <w:color w:val="000000"/>
+              <w:sz w:val="24"/>
+              <w:lang w:val="ru-RU"/>
+              <w:lang w:val="ru-RU"/>
+            </w:rPr>
+            <w:t xml:space="preserve">без </w:t>
+          </w:r>
+          <w:r>
+            <w:rPr>
+              <w:rFonts w:ascii="DejaVu Serif" w:hAnsi="DejaVu Serif"/>
+              <w:color w:val="000000"/>
+              <w:sz w:val="24"/>
+              <w:lang w:val="ru-RU"/>
+              <w:lang w:val="ru-RU"/>
+            </w:rPr>
+            <w:t>денег</w:t>
+          </w:r>
+        </w:hyperlink>
       </w:hyperlink>
     </w:p>
     <w:p>
@@ -544,97 +554,99 @@
           <w:lang w:val="ru-RU"/>
         </w:rPr>
       </w:pPr>
-      <w:hyperlink w:anchor="chapter_6">
-        <w:r>
-          <w:rPr>
-            <w:rFonts w:ascii="DejaVu Serif" w:hAnsi="DejaVu Serif"/>
-            <w:color w:val="000000"/>
-            <w:sz w:val="24"/>
-            <w:lang w:val="ru-RU"/>
-            <w:lang w:val="ru-RU"/>
-          </w:rPr>
-          <w:t xml:space="preserve">Глава </w:t>
-        </w:r>
-        <w:r>
-          <w:rPr>
-            <w:rFonts w:ascii="DejaVu Serif" w:hAnsi="DejaVu Serif"/>
-            <w:color w:val="000000"/>
-            <w:sz w:val="24"/>
-            <w:lang w:val="ru-RU"/>
-            <w:lang w:val="ru-RU"/>
-          </w:rPr>
-          <w:t xml:space="preserve">6. </w:t>
-        </w:r>
-        <w:r>
-          <w:rPr>
-            <w:rFonts w:ascii="DejaVu Serif" w:hAnsi="DejaVu Serif"/>
-            <w:color w:val="000000"/>
-            <w:sz w:val="24"/>
-            <w:lang w:val="ru-RU"/>
-            <w:lang w:val="ru-RU"/>
-          </w:rPr>
-          <w:t xml:space="preserve">Труд, </w:t>
-        </w:r>
-        <w:r>
-          <w:rPr>
-            <w:rFonts w:ascii="DejaVu Serif" w:hAnsi="DejaVu Serif"/>
-            <w:color w:val="000000"/>
-            <w:sz w:val="24"/>
-            <w:lang w:val="ru-RU"/>
-            <w:lang w:val="ru-RU"/>
-          </w:rPr>
-          <w:t xml:space="preserve">обеспечение </w:t>
-        </w:r>
-        <w:r>
-          <w:rPr>
-            <w:rFonts w:ascii="DejaVu Serif" w:hAnsi="DejaVu Serif"/>
-            <w:color w:val="000000"/>
-            <w:sz w:val="24"/>
-            <w:lang w:val="ru-RU"/>
-            <w:lang w:val="ru-RU"/>
-          </w:rPr>
-          <w:t xml:space="preserve">потребностей </w:t>
-        </w:r>
-        <w:r>
-          <w:rPr>
-            <w:rFonts w:ascii="DejaVu Serif" w:hAnsi="DejaVu Serif"/>
-            <w:color w:val="000000"/>
-            <w:sz w:val="24"/>
-            <w:lang w:val="ru-RU"/>
-            <w:lang w:val="ru-RU"/>
-          </w:rPr>
-          <w:t xml:space="preserve">и </w:t>
-        </w:r>
-        <w:r>
-          <w:rPr>
-            <w:rFonts w:ascii="DejaVu Serif" w:hAnsi="DejaVu Serif"/>
-            <w:color w:val="000000"/>
-            <w:sz w:val="24"/>
-            <w:lang w:val="ru-RU"/>
-            <w:lang w:val="ru-RU"/>
-          </w:rPr>
-          <w:t xml:space="preserve">забота </w:t>
-        </w:r>
-        <w:r>
-          <w:rPr>
-            <w:rFonts w:ascii="DejaVu Serif" w:hAnsi="DejaVu Serif"/>
-            <w:color w:val="000000"/>
-            <w:sz w:val="24"/>
-            <w:lang w:val="ru-RU"/>
-            <w:lang w:val="ru-RU"/>
-          </w:rPr>
-          <w:t xml:space="preserve">о </w:t>
-        </w:r>
-        <w:r>
-          <w:rPr>
-            <w:rFonts w:ascii="DejaVu Serif" w:hAnsi="DejaVu Serif"/>
-            <w:color w:val="000000"/>
-            <w:sz w:val="24"/>
-            <w:lang w:val="ru-RU"/>
-            <w:lang w:val="ru-RU"/>
-          </w:rPr>
-          <w:t>человеке</w:t>
-        </w:r>
+      <w:hyperlink w:anchor="chapter_6" w:history="1">
+        <w:hyperlink w:anchor="chapter_6">
+          <w:r>
+            <w:rPr>
+              <w:rFonts w:ascii="DejaVu Serif" w:hAnsi="DejaVu Serif"/>
+              <w:color w:val="000000"/>
+              <w:sz w:val="24"/>
+              <w:lang w:val="ru-RU"/>
+              <w:lang w:val="ru-RU"/>
+            </w:rPr>
+            <w:t xml:space="preserve">Глава </w:t>
+          </w:r>
+          <w:r>
+            <w:rPr>
+              <w:rFonts w:ascii="DejaVu Serif" w:hAnsi="DejaVu Serif"/>
+              <w:color w:val="000000"/>
+              <w:sz w:val="24"/>
+              <w:lang w:val="ru-RU"/>
+              <w:lang w:val="ru-RU"/>
+            </w:rPr>
+            <w:t xml:space="preserve">6. </w:t>
+          </w:r>
+          <w:r>
+            <w:rPr>
+              <w:rFonts w:ascii="DejaVu Serif" w:hAnsi="DejaVu Serif"/>
+              <w:color w:val="000000"/>
+              <w:sz w:val="24"/>
+              <w:lang w:val="ru-RU"/>
+              <w:lang w:val="ru-RU"/>
+            </w:rPr>
+            <w:t xml:space="preserve">Труд, </w:t>
+          </w:r>
+          <w:r>
+            <w:rPr>
+              <w:rFonts w:ascii="DejaVu Serif" w:hAnsi="DejaVu Serif"/>
+              <w:color w:val="000000"/>
+              <w:sz w:val="24"/>
+              <w:lang w:val="ru-RU"/>
+              <w:lang w:val="ru-RU"/>
+            </w:rPr>
+            <w:t xml:space="preserve">обеспечение </w:t>
+          </w:r>
+          <w:r>
+            <w:rPr>
+              <w:rFonts w:ascii="DejaVu Serif" w:hAnsi="DejaVu Serif"/>
+              <w:color w:val="000000"/>
+              <w:sz w:val="24"/>
+              <w:lang w:val="ru-RU"/>
+              <w:lang w:val="ru-RU"/>
+            </w:rPr>
+            <w:t xml:space="preserve">потребностей </w:t>
+          </w:r>
+          <w:r>
+            <w:rPr>
+              <w:rFonts w:ascii="DejaVu Serif" w:hAnsi="DejaVu Serif"/>
+              <w:color w:val="000000"/>
+              <w:sz w:val="24"/>
+              <w:lang w:val="ru-RU"/>
+              <w:lang w:val="ru-RU"/>
+            </w:rPr>
+            <w:t xml:space="preserve">и </w:t>
+          </w:r>
+          <w:r>
+            <w:rPr>
+              <w:rFonts w:ascii="DejaVu Serif" w:hAnsi="DejaVu Serif"/>
+              <w:color w:val="000000"/>
+              <w:sz w:val="24"/>
+              <w:lang w:val="ru-RU"/>
+              <w:lang w:val="ru-RU"/>
+            </w:rPr>
+            <w:t xml:space="preserve">забота </w:t>
+          </w:r>
+          <w:r>
+            <w:rPr>
+              <w:rFonts w:ascii="DejaVu Serif" w:hAnsi="DejaVu Serif"/>
+              <w:color w:val="000000"/>
+              <w:sz w:val="24"/>
+              <w:lang w:val="ru-RU"/>
+              <w:lang w:val="ru-RU"/>
+            </w:rPr>
+            <w:t xml:space="preserve">о </w:t>
+          </w:r>
+          <w:r>
+            <w:rPr>
+              <w:rFonts w:ascii="DejaVu Serif" w:hAnsi="DejaVu Serif"/>
+              <w:color w:val="000000"/>
+              <w:sz w:val="24"/>
+              <w:lang w:val="ru-RU"/>
+              <w:lang w:val="ru-RU"/>
+            </w:rPr>
+            <w:t>человеке</w:t>
+          </w:r>
+        </w:hyperlink>
       </w:hyperlink>
     </w:p>
     <w:p>
@@ -650,97 +662,99 @@
           <w:lang w:val="ru-RU"/>
         </w:rPr>
       </w:pPr>
-      <w:hyperlink w:anchor="chapter_7">
-        <w:r>
-          <w:rPr>
-            <w:rFonts w:ascii="DejaVu Serif" w:hAnsi="DejaVu Serif"/>
-            <w:color w:val="000000"/>
-            <w:sz w:val="24"/>
-            <w:lang w:val="ru-RU"/>
-            <w:lang w:val="ru-RU"/>
-          </w:rPr>
-          <w:t xml:space="preserve">Глава </w:t>
-        </w:r>
-        <w:r>
-          <w:rPr>
-            <w:rFonts w:ascii="DejaVu Serif" w:hAnsi="DejaVu Serif"/>
-            <w:color w:val="000000"/>
-            <w:sz w:val="24"/>
-            <w:lang w:val="ru-RU"/>
-            <w:lang w:val="ru-RU"/>
-          </w:rPr>
-          <w:t xml:space="preserve">7. </w:t>
-        </w:r>
-        <w:r>
-          <w:rPr>
-            <w:rFonts w:ascii="DejaVu Serif" w:hAnsi="DejaVu Serif"/>
-            <w:color w:val="000000"/>
-            <w:sz w:val="24"/>
-            <w:lang w:val="ru-RU"/>
-            <w:lang w:val="ru-RU"/>
-          </w:rPr>
-          <w:t xml:space="preserve">Семья, </w:t>
-        </w:r>
-        <w:r>
-          <w:rPr>
-            <w:rFonts w:ascii="DejaVu Serif" w:hAnsi="DejaVu Serif"/>
-            <w:color w:val="000000"/>
-            <w:sz w:val="24"/>
-            <w:lang w:val="ru-RU"/>
-            <w:lang w:val="ru-RU"/>
-          </w:rPr>
-          <w:t xml:space="preserve">дети </w:t>
-        </w:r>
-        <w:r>
-          <w:rPr>
-            <w:rFonts w:ascii="DejaVu Serif" w:hAnsi="DejaVu Serif"/>
-            <w:color w:val="000000"/>
-            <w:sz w:val="24"/>
-            <w:lang w:val="ru-RU"/>
-            <w:lang w:val="ru-RU"/>
-          </w:rPr>
-          <w:t xml:space="preserve">и </w:t>
-        </w:r>
-        <w:r>
-          <w:rPr>
-            <w:rFonts w:ascii="DejaVu Serif" w:hAnsi="DejaVu Serif"/>
-            <w:color w:val="000000"/>
-            <w:sz w:val="24"/>
-            <w:lang w:val="ru-RU"/>
-            <w:lang w:val="ru-RU"/>
-          </w:rPr>
-          <w:t xml:space="preserve">воспитание </w:t>
-        </w:r>
-        <w:r>
-          <w:rPr>
-            <w:rFonts w:ascii="DejaVu Serif" w:hAnsi="DejaVu Serif"/>
-            <w:color w:val="000000"/>
-            <w:sz w:val="24"/>
-            <w:lang w:val="ru-RU"/>
-            <w:lang w:val="ru-RU"/>
-          </w:rPr>
-          <w:t xml:space="preserve">в </w:t>
-        </w:r>
-        <w:r>
-          <w:rPr>
-            <w:rFonts w:ascii="DejaVu Serif" w:hAnsi="DejaVu Serif"/>
-            <w:color w:val="000000"/>
-            <w:sz w:val="24"/>
-            <w:lang w:val="ru-RU"/>
-            <w:lang w:val="ru-RU"/>
-          </w:rPr>
-          <w:t xml:space="preserve">новом </w:t>
-        </w:r>
-        <w:r>
-          <w:rPr>
-            <w:rFonts w:ascii="DejaVu Serif" w:hAnsi="DejaVu Serif"/>
-            <w:color w:val="000000"/>
-            <w:sz w:val="24"/>
-            <w:lang w:val="ru-RU"/>
-            <w:lang w:val="ru-RU"/>
-          </w:rPr>
-          <w:t>обществе</w:t>
-        </w:r>
+      <w:hyperlink w:anchor="chapter_7" w:history="1">
+        <w:hyperlink w:anchor="chapter_7">
+          <w:r>
+            <w:rPr>
+              <w:rFonts w:ascii="DejaVu Serif" w:hAnsi="DejaVu Serif"/>
+              <w:color w:val="000000"/>
+              <w:sz w:val="24"/>
+              <w:lang w:val="ru-RU"/>
+              <w:lang w:val="ru-RU"/>
+            </w:rPr>
+            <w:t xml:space="preserve">Глава </w:t>
+          </w:r>
+          <w:r>
+            <w:rPr>
+              <w:rFonts w:ascii="DejaVu Serif" w:hAnsi="DejaVu Serif"/>
+              <w:color w:val="000000"/>
+              <w:sz w:val="24"/>
+              <w:lang w:val="ru-RU"/>
+              <w:lang w:val="ru-RU"/>
+            </w:rPr>
+            <w:t xml:space="preserve">7. </w:t>
+          </w:r>
+          <w:r>
+            <w:rPr>
+              <w:rFonts w:ascii="DejaVu Serif" w:hAnsi="DejaVu Serif"/>
+              <w:color w:val="000000"/>
+              <w:sz w:val="24"/>
+              <w:lang w:val="ru-RU"/>
+              <w:lang w:val="ru-RU"/>
+            </w:rPr>
+            <w:t xml:space="preserve">Семья, </w:t>
+          </w:r>
+          <w:r>
+            <w:rPr>
+              <w:rFonts w:ascii="DejaVu Serif" w:hAnsi="DejaVu Serif"/>
+              <w:color w:val="000000"/>
+              <w:sz w:val="24"/>
+              <w:lang w:val="ru-RU"/>
+              <w:lang w:val="ru-RU"/>
+            </w:rPr>
+            <w:t xml:space="preserve">дети </w:t>
+          </w:r>
+          <w:r>
+            <w:rPr>
+              <w:rFonts w:ascii="DejaVu Serif" w:hAnsi="DejaVu Serif"/>
+              <w:color w:val="000000"/>
+              <w:sz w:val="24"/>
+              <w:lang w:val="ru-RU"/>
+              <w:lang w:val="ru-RU"/>
+            </w:rPr>
+            <w:t xml:space="preserve">и </w:t>
+          </w:r>
+          <w:r>
+            <w:rPr>
+              <w:rFonts w:ascii="DejaVu Serif" w:hAnsi="DejaVu Serif"/>
+              <w:color w:val="000000"/>
+              <w:sz w:val="24"/>
+              <w:lang w:val="ru-RU"/>
+              <w:lang w:val="ru-RU"/>
+            </w:rPr>
+            <w:t xml:space="preserve">воспитание </w:t>
+          </w:r>
+          <w:r>
+            <w:rPr>
+              <w:rFonts w:ascii="DejaVu Serif" w:hAnsi="DejaVu Serif"/>
+              <w:color w:val="000000"/>
+              <w:sz w:val="24"/>
+              <w:lang w:val="ru-RU"/>
+              <w:lang w:val="ru-RU"/>
+            </w:rPr>
+            <w:t xml:space="preserve">в </w:t>
+          </w:r>
+          <w:r>
+            <w:rPr>
+              <w:rFonts w:ascii="DejaVu Serif" w:hAnsi="DejaVu Serif"/>
+              <w:color w:val="000000"/>
+              <w:sz w:val="24"/>
+              <w:lang w:val="ru-RU"/>
+              <w:lang w:val="ru-RU"/>
+            </w:rPr>
+            <w:t xml:space="preserve">новом </w:t>
+          </w:r>
+          <w:r>
+            <w:rPr>
+              <w:rFonts w:ascii="DejaVu Serif" w:hAnsi="DejaVu Serif"/>
+              <w:color w:val="000000"/>
+              <w:sz w:val="24"/>
+              <w:lang w:val="ru-RU"/>
+              <w:lang w:val="ru-RU"/>
+            </w:rPr>
+            <w:t>обществе</w:t>
+          </w:r>
+        </w:hyperlink>
       </w:hyperlink>
     </w:p>
     <w:p>
@@ -756,87 +770,89 @@
           <w:lang w:val="ru-RU"/>
         </w:rPr>
       </w:pPr>
-      <w:hyperlink w:anchor="chapter_9">
-        <w:r>
-          <w:rPr>
-            <w:rFonts w:ascii="DejaVu Serif" w:hAnsi="DejaVu Serif"/>
-            <w:color w:val="000000"/>
-            <w:sz w:val="24"/>
-            <w:lang w:val="ru-RU"/>
-            <w:lang w:val="ru-RU"/>
-          </w:rPr>
-          <w:t xml:space="preserve">Глава </w:t>
-        </w:r>
-        <w:r>
-          <w:rPr>
-            <w:rFonts w:ascii="DejaVu Serif" w:hAnsi="DejaVu Serif"/>
-            <w:color w:val="000000"/>
-            <w:sz w:val="24"/>
-            <w:lang w:val="ru-RU"/>
-            <w:lang w:val="ru-RU"/>
-          </w:rPr>
-          <w:t xml:space="preserve">9. </w:t>
-        </w:r>
-        <w:r>
-          <w:rPr>
-            <w:rFonts w:ascii="DejaVu Serif" w:hAnsi="DejaVu Serif"/>
-            <w:color w:val="000000"/>
-            <w:sz w:val="24"/>
-            <w:lang w:val="ru-RU"/>
-            <w:lang w:val="ru-RU"/>
-          </w:rPr>
-          <w:t xml:space="preserve">Свобода, </w:t>
-        </w:r>
-        <w:r>
-          <w:rPr>
-            <w:rFonts w:ascii="DejaVu Serif" w:hAnsi="DejaVu Serif"/>
-            <w:color w:val="000000"/>
-            <w:sz w:val="24"/>
-            <w:lang w:val="ru-RU"/>
-            <w:lang w:val="ru-RU"/>
-          </w:rPr>
-          <w:t xml:space="preserve">церковный </w:t>
-        </w:r>
-        <w:r>
-          <w:rPr>
-            <w:rFonts w:ascii="DejaVu Serif" w:hAnsi="DejaVu Serif"/>
-            <w:color w:val="000000"/>
-            <w:sz w:val="24"/>
-            <w:lang w:val="ru-RU"/>
-            <w:lang w:val="ru-RU"/>
-          </w:rPr>
-          <w:t xml:space="preserve">суд </w:t>
-        </w:r>
-        <w:r>
-          <w:rPr>
-            <w:rFonts w:ascii="DejaVu Serif" w:hAnsi="DejaVu Serif"/>
-            <w:color w:val="000000"/>
-            <w:sz w:val="24"/>
-            <w:lang w:val="ru-RU"/>
-            <w:lang w:val="ru-RU"/>
-          </w:rPr>
-          <w:t xml:space="preserve">и </w:t>
-        </w:r>
-        <w:r>
-          <w:rPr>
-            <w:rFonts w:ascii="DejaVu Serif" w:hAnsi="DejaVu Serif"/>
-            <w:color w:val="000000"/>
-            <w:sz w:val="24"/>
-            <w:lang w:val="ru-RU"/>
-            <w:lang w:val="ru-RU"/>
-          </w:rPr>
-          <w:t xml:space="preserve">защита </w:t>
-        </w:r>
-        <w:r>
-          <w:rPr>
-            <w:rFonts w:ascii="DejaVu Serif" w:hAnsi="DejaVu Serif"/>
-            <w:color w:val="000000"/>
-            <w:sz w:val="24"/>
-            <w:lang w:val="ru-RU"/>
-            <w:lang w:val="ru-RU"/>
-          </w:rPr>
-          <w:t>человека</w:t>
-        </w:r>
+      <w:hyperlink w:anchor="chapter_8" w:history="1">
+        <w:hyperlink w:anchor="chapter_9">
+          <w:r>
+            <w:rPr>
+              <w:rFonts w:ascii="DejaVu Serif" w:hAnsi="DejaVu Serif"/>
+              <w:color w:val="000000"/>
+              <w:sz w:val="24"/>
+              <w:lang w:val="ru-RU"/>
+              <w:lang w:val="ru-RU"/>
+            </w:rPr>
+            <w:t xml:space="preserve">Глава </w:t>
+          </w:r>
+          <w:r>
+            <w:rPr>
+              <w:rFonts w:ascii="DejaVu Serif" w:hAnsi="DejaVu Serif"/>
+              <w:color w:val="000000"/>
+              <w:sz w:val="24"/>
+              <w:lang w:val="ru-RU"/>
+              <w:lang w:val="ru-RU"/>
+            </w:rPr>
+            <w:t xml:space="preserve">8. </w:t>
+          </w:r>
+          <w:r>
+            <w:rPr>
+              <w:rFonts w:ascii="DejaVu Serif" w:hAnsi="DejaVu Serif"/>
+              <w:color w:val="000000"/>
+              <w:sz w:val="24"/>
+              <w:lang w:val="ru-RU"/>
+              <w:lang w:val="ru-RU"/>
+            </w:rPr>
+            <w:t xml:space="preserve">Свобода, </w:t>
+          </w:r>
+          <w:r>
+            <w:rPr>
+              <w:rFonts w:ascii="DejaVu Serif" w:hAnsi="DejaVu Serif"/>
+              <w:color w:val="000000"/>
+              <w:sz w:val="24"/>
+              <w:lang w:val="ru-RU"/>
+              <w:lang w:val="ru-RU"/>
+            </w:rPr>
+            <w:t xml:space="preserve">церковный </w:t>
+          </w:r>
+          <w:r>
+            <w:rPr>
+              <w:rFonts w:ascii="DejaVu Serif" w:hAnsi="DejaVu Serif"/>
+              <w:color w:val="000000"/>
+              <w:sz w:val="24"/>
+              <w:lang w:val="ru-RU"/>
+              <w:lang w:val="ru-RU"/>
+            </w:rPr>
+            <w:t xml:space="preserve">суд </w:t>
+          </w:r>
+          <w:r>
+            <w:rPr>
+              <w:rFonts w:ascii="DejaVu Serif" w:hAnsi="DejaVu Serif"/>
+              <w:color w:val="000000"/>
+              <w:sz w:val="24"/>
+              <w:lang w:val="ru-RU"/>
+              <w:lang w:val="ru-RU"/>
+            </w:rPr>
+            <w:t xml:space="preserve">и </w:t>
+          </w:r>
+          <w:r>
+            <w:rPr>
+              <w:rFonts w:ascii="DejaVu Serif" w:hAnsi="DejaVu Serif"/>
+              <w:color w:val="000000"/>
+              <w:sz w:val="24"/>
+              <w:lang w:val="ru-RU"/>
+              <w:lang w:val="ru-RU"/>
+            </w:rPr>
+            <w:t xml:space="preserve">защита </w:t>
+          </w:r>
+          <w:r>
+            <w:rPr>
+              <w:rFonts w:ascii="DejaVu Serif" w:hAnsi="DejaVu Serif"/>
+              <w:color w:val="000000"/>
+              <w:sz w:val="24"/>
+              <w:lang w:val="ru-RU"/>
+              <w:lang w:val="ru-RU"/>
+            </w:rPr>
+            <w:t>человека</w:t>
+          </w:r>
+        </w:hyperlink>
       </w:hyperlink>
     </w:p>
     <w:p>
@@ -852,87 +868,89 @@
           <w:lang w:val="ru-RU"/>
         </w:rPr>
       </w:pPr>
-      <w:hyperlink w:anchor="chapter_10">
-        <w:r>
-          <w:rPr>
-            <w:rFonts w:ascii="DejaVu Serif" w:hAnsi="DejaVu Serif"/>
-            <w:color w:val="000000"/>
-            <w:sz w:val="24"/>
-            <w:lang w:val="ru-RU"/>
-            <w:lang w:val="ru-RU"/>
-          </w:rPr>
-          <w:t xml:space="preserve">Глава </w:t>
-        </w:r>
-        <w:r>
-          <w:rPr>
-            <w:rFonts w:ascii="DejaVu Serif" w:hAnsi="DejaVu Serif"/>
-            <w:color w:val="000000"/>
-            <w:sz w:val="24"/>
-            <w:lang w:val="ru-RU"/>
-            <w:lang w:val="ru-RU"/>
-          </w:rPr>
-          <w:t xml:space="preserve">10. </w:t>
-        </w:r>
-        <w:r>
-          <w:rPr>
-            <w:rFonts w:ascii="DejaVu Serif" w:hAnsi="DejaVu Serif"/>
-            <w:color w:val="000000"/>
-            <w:sz w:val="24"/>
-            <w:lang w:val="ru-RU"/>
-            <w:lang w:val="ru-RU"/>
-          </w:rPr>
-          <w:t xml:space="preserve">Безопасность </w:t>
-        </w:r>
-        <w:r>
-          <w:rPr>
-            <w:rFonts w:ascii="DejaVu Serif" w:hAnsi="DejaVu Serif"/>
-            <w:color w:val="000000"/>
-            <w:sz w:val="24"/>
-            <w:lang w:val="ru-RU"/>
-            <w:lang w:val="ru-RU"/>
-          </w:rPr>
-          <w:t xml:space="preserve">и </w:t>
-        </w:r>
-        <w:r>
-          <w:rPr>
-            <w:rFonts w:ascii="DejaVu Serif" w:hAnsi="DejaVu Serif"/>
-            <w:color w:val="000000"/>
-            <w:sz w:val="24"/>
-            <w:lang w:val="ru-RU"/>
-            <w:lang w:val="ru-RU"/>
-          </w:rPr>
-          <w:t xml:space="preserve">отношения </w:t>
-        </w:r>
-        <w:r>
-          <w:rPr>
-            <w:rFonts w:ascii="DejaVu Serif" w:hAnsi="DejaVu Serif"/>
-            <w:color w:val="000000"/>
-            <w:sz w:val="24"/>
-            <w:lang w:val="ru-RU"/>
-            <w:lang w:val="ru-RU"/>
-          </w:rPr>
-          <w:t xml:space="preserve">с </w:t>
-        </w:r>
-        <w:r>
-          <w:rPr>
-            <w:rFonts w:ascii="DejaVu Serif" w:hAnsi="DejaVu Serif"/>
-            <w:color w:val="000000"/>
-            <w:sz w:val="24"/>
-            <w:lang w:val="ru-RU"/>
-            <w:lang w:val="ru-RU"/>
-          </w:rPr>
-          <w:t xml:space="preserve">другими </w:t>
-        </w:r>
-        <w:r>
-          <w:rPr>
-            <w:rFonts w:ascii="DejaVu Serif" w:hAnsi="DejaVu Serif"/>
-            <w:color w:val="000000"/>
-            <w:sz w:val="24"/>
-            <w:lang w:val="ru-RU"/>
-            <w:lang w:val="ru-RU"/>
-          </w:rPr>
-          <w:t>государствами</w:t>
-        </w:r>
+      <w:hyperlink w:anchor="chapter_9" w:history="1">
+        <w:hyperlink w:anchor="chapter_10">
+          <w:r>
+            <w:rPr>
+              <w:rFonts w:ascii="DejaVu Serif" w:hAnsi="DejaVu Serif"/>
+              <w:color w:val="000000"/>
+              <w:sz w:val="24"/>
+              <w:lang w:val="ru-RU"/>
+              <w:lang w:val="ru-RU"/>
+            </w:rPr>
+            <w:t xml:space="preserve">Глава </w:t>
+          </w:r>
+          <w:r>
+            <w:rPr>
+              <w:rFonts w:ascii="DejaVu Serif" w:hAnsi="DejaVu Serif"/>
+              <w:color w:val="000000"/>
+              <w:sz w:val="24"/>
+              <w:lang w:val="ru-RU"/>
+              <w:lang w:val="ru-RU"/>
+            </w:rPr>
+            <w:t xml:space="preserve">9. </w:t>
+          </w:r>
+          <w:r>
+            <w:rPr>
+              <w:rFonts w:ascii="DejaVu Serif" w:hAnsi="DejaVu Serif"/>
+              <w:color w:val="000000"/>
+              <w:sz w:val="24"/>
+              <w:lang w:val="ru-RU"/>
+              <w:lang w:val="ru-RU"/>
+            </w:rPr>
+            <w:t xml:space="preserve">Безопасность </w:t>
+          </w:r>
+          <w:r>
+            <w:rPr>
+              <w:rFonts w:ascii="DejaVu Serif" w:hAnsi="DejaVu Serif"/>
+              <w:color w:val="000000"/>
+              <w:sz w:val="24"/>
+              <w:lang w:val="ru-RU"/>
+              <w:lang w:val="ru-RU"/>
+            </w:rPr>
+            <w:t xml:space="preserve">и </w:t>
+          </w:r>
+          <w:r>
+            <w:rPr>
+              <w:rFonts w:ascii="DejaVu Serif" w:hAnsi="DejaVu Serif"/>
+              <w:color w:val="000000"/>
+              <w:sz w:val="24"/>
+              <w:lang w:val="ru-RU"/>
+              <w:lang w:val="ru-RU"/>
+            </w:rPr>
+            <w:t xml:space="preserve">отношения </w:t>
+          </w:r>
+          <w:r>
+            <w:rPr>
+              <w:rFonts w:ascii="DejaVu Serif" w:hAnsi="DejaVu Serif"/>
+              <w:color w:val="000000"/>
+              <w:sz w:val="24"/>
+              <w:lang w:val="ru-RU"/>
+              <w:lang w:val="ru-RU"/>
+            </w:rPr>
+            <w:t xml:space="preserve">с </w:t>
+          </w:r>
+          <w:r>
+            <w:rPr>
+              <w:rFonts w:ascii="DejaVu Serif" w:hAnsi="DejaVu Serif"/>
+              <w:color w:val="000000"/>
+              <w:sz w:val="24"/>
+              <w:lang w:val="ru-RU"/>
+              <w:lang w:val="ru-RU"/>
+            </w:rPr>
+            <w:t xml:space="preserve">другими </w:t>
+          </w:r>
+          <w:r>
+            <w:rPr>
+              <w:rFonts w:ascii="DejaVu Serif" w:hAnsi="DejaVu Serif"/>
+              <w:color w:val="000000"/>
+              <w:sz w:val="24"/>
+              <w:lang w:val="ru-RU"/>
+              <w:lang w:val="ru-RU"/>
+            </w:rPr>
+            <w:t>государствами</w:t>
+          </w:r>
+        </w:hyperlink>
       </w:hyperlink>
     </w:p>
     <w:p>
@@ -948,107 +966,109 @@
           <w:lang w:val="ru-RU"/>
         </w:rPr>
       </w:pPr>
-      <w:hyperlink w:anchor="chapter_11">
-        <w:r>
-          <w:rPr>
-            <w:rFonts w:ascii="DejaVu Serif" w:hAnsi="DejaVu Serif"/>
-            <w:color w:val="000000"/>
-            <w:sz w:val="24"/>
-            <w:lang w:val="ru-RU"/>
-            <w:lang w:val="ru-RU"/>
-          </w:rPr>
-          <w:t xml:space="preserve">Глава </w:t>
-        </w:r>
-        <w:r>
-          <w:rPr>
-            <w:rFonts w:ascii="DejaVu Serif" w:hAnsi="DejaVu Serif"/>
-            <w:color w:val="000000"/>
-            <w:sz w:val="24"/>
-            <w:lang w:val="ru-RU"/>
-            <w:lang w:val="ru-RU"/>
-          </w:rPr>
-          <w:t xml:space="preserve">11. </w:t>
-        </w:r>
-        <w:r>
-          <w:rPr>
-            <w:rFonts w:ascii="DejaVu Serif" w:hAnsi="DejaVu Serif"/>
-            <w:color w:val="000000"/>
-            <w:sz w:val="24"/>
-            <w:lang w:val="ru-RU"/>
-            <w:lang w:val="ru-RU"/>
-          </w:rPr>
-          <w:t xml:space="preserve">Для </w:t>
-        </w:r>
-        <w:r>
-          <w:rPr>
-            <w:rFonts w:ascii="DejaVu Serif" w:hAnsi="DejaVu Serif"/>
-            <w:color w:val="000000"/>
-            <w:sz w:val="24"/>
-            <w:lang w:val="ru-RU"/>
-            <w:lang w:val="ru-RU"/>
-          </w:rPr>
-          <w:t xml:space="preserve">чего </w:t>
-        </w:r>
-        <w:r>
-          <w:rPr>
-            <w:rFonts w:ascii="DejaVu Serif" w:hAnsi="DejaVu Serif"/>
-            <w:color w:val="000000"/>
-            <w:sz w:val="24"/>
-            <w:lang w:val="ru-RU"/>
-            <w:lang w:val="ru-RU"/>
-          </w:rPr>
-          <w:t xml:space="preserve">живёт </w:t>
-        </w:r>
-        <w:r>
-          <w:rPr>
-            <w:rFonts w:ascii="DejaVu Serif" w:hAnsi="DejaVu Serif"/>
-            <w:color w:val="000000"/>
-            <w:sz w:val="24"/>
-            <w:lang w:val="ru-RU"/>
-            <w:lang w:val="ru-RU"/>
-          </w:rPr>
-          <w:t xml:space="preserve">человек </w:t>
-        </w:r>
-        <w:r>
-          <w:rPr>
-            <w:rFonts w:ascii="DejaVu Serif" w:hAnsi="DejaVu Serif"/>
-            <w:color w:val="000000"/>
-            <w:sz w:val="24"/>
-            <w:lang w:val="ru-RU"/>
-            <w:lang w:val="ru-RU"/>
-          </w:rPr>
-          <w:t xml:space="preserve">и </w:t>
-        </w:r>
-        <w:r>
-          <w:rPr>
-            <w:rFonts w:ascii="DejaVu Serif" w:hAnsi="DejaVu Serif"/>
-            <w:color w:val="000000"/>
-            <w:sz w:val="24"/>
-            <w:lang w:val="ru-RU"/>
-            <w:lang w:val="ru-RU"/>
-          </w:rPr>
-          <w:t xml:space="preserve">зачем </w:t>
-        </w:r>
-        <w:r>
-          <w:rPr>
-            <w:rFonts w:ascii="DejaVu Serif" w:hAnsi="DejaVu Serif"/>
-            <w:color w:val="000000"/>
-            <w:sz w:val="24"/>
-            <w:lang w:val="ru-RU"/>
-            <w:lang w:val="ru-RU"/>
-          </w:rPr>
-          <w:t xml:space="preserve">ему </w:t>
-        </w:r>
-        <w:r>
-          <w:rPr>
-            <w:rFonts w:ascii="DejaVu Serif" w:hAnsi="DejaVu Serif"/>
-            <w:color w:val="000000"/>
-            <w:sz w:val="24"/>
-            <w:lang w:val="ru-RU"/>
-            <w:lang w:val="ru-RU"/>
-          </w:rPr>
-          <w:t>меняться?</w:t>
-        </w:r>
+      <w:hyperlink w:anchor="chapter_10" w:history="1">
+        <w:hyperlink w:anchor="chapter_11">
+          <w:r>
+            <w:rPr>
+              <w:rFonts w:ascii="DejaVu Serif" w:hAnsi="DejaVu Serif"/>
+              <w:color w:val="000000"/>
+              <w:sz w:val="24"/>
+              <w:lang w:val="ru-RU"/>
+              <w:lang w:val="ru-RU"/>
+            </w:rPr>
+            <w:t xml:space="preserve">Глава </w:t>
+          </w:r>
+          <w:r>
+            <w:rPr>
+              <w:rFonts w:ascii="DejaVu Serif" w:hAnsi="DejaVu Serif"/>
+              <w:color w:val="000000"/>
+              <w:sz w:val="24"/>
+              <w:lang w:val="ru-RU"/>
+              <w:lang w:val="ru-RU"/>
+            </w:rPr>
+            <w:t xml:space="preserve">10. </w:t>
+          </w:r>
+          <w:r>
+            <w:rPr>
+              <w:rFonts w:ascii="DejaVu Serif" w:hAnsi="DejaVu Serif"/>
+              <w:color w:val="000000"/>
+              <w:sz w:val="24"/>
+              <w:lang w:val="ru-RU"/>
+              <w:lang w:val="ru-RU"/>
+            </w:rPr>
+            <w:t xml:space="preserve">Для </w:t>
+          </w:r>
+          <w:r>
+            <w:rPr>
+              <w:rFonts w:ascii="DejaVu Serif" w:hAnsi="DejaVu Serif"/>
+              <w:color w:val="000000"/>
+              <w:sz w:val="24"/>
+              <w:lang w:val="ru-RU"/>
+              <w:lang w:val="ru-RU"/>
+            </w:rPr>
+            <w:t xml:space="preserve">чего </w:t>
+          </w:r>
+          <w:r>
+            <w:rPr>
+              <w:rFonts w:ascii="DejaVu Serif" w:hAnsi="DejaVu Serif"/>
+              <w:color w:val="000000"/>
+              <w:sz w:val="24"/>
+              <w:lang w:val="ru-RU"/>
+              <w:lang w:val="ru-RU"/>
+            </w:rPr>
+            <w:t xml:space="preserve">живёт </w:t>
+          </w:r>
+          <w:r>
+            <w:rPr>
+              <w:rFonts w:ascii="DejaVu Serif" w:hAnsi="DejaVu Serif"/>
+              <w:color w:val="000000"/>
+              <w:sz w:val="24"/>
+              <w:lang w:val="ru-RU"/>
+              <w:lang w:val="ru-RU"/>
+            </w:rPr>
+            <w:t xml:space="preserve">человек </w:t>
+          </w:r>
+          <w:r>
+            <w:rPr>
+              <w:rFonts w:ascii="DejaVu Serif" w:hAnsi="DejaVu Serif"/>
+              <w:color w:val="000000"/>
+              <w:sz w:val="24"/>
+              <w:lang w:val="ru-RU"/>
+              <w:lang w:val="ru-RU"/>
+            </w:rPr>
+            <w:t xml:space="preserve">и </w:t>
+          </w:r>
+          <w:r>
+            <w:rPr>
+              <w:rFonts w:ascii="DejaVu Serif" w:hAnsi="DejaVu Serif"/>
+              <w:color w:val="000000"/>
+              <w:sz w:val="24"/>
+              <w:lang w:val="ru-RU"/>
+              <w:lang w:val="ru-RU"/>
+            </w:rPr>
+            <w:t xml:space="preserve">зачем </w:t>
+          </w:r>
+          <w:r>
+            <w:rPr>
+              <w:rFonts w:ascii="DejaVu Serif" w:hAnsi="DejaVu Serif"/>
+              <w:color w:val="000000"/>
+              <w:sz w:val="24"/>
+              <w:lang w:val="ru-RU"/>
+              <w:lang w:val="ru-RU"/>
+            </w:rPr>
+            <w:t xml:space="preserve">ему </w:t>
+          </w:r>
+          <w:r>
+            <w:rPr>
+              <w:rFonts w:ascii="DejaVu Serif" w:hAnsi="DejaVu Serif"/>
+              <w:color w:val="000000"/>
+              <w:sz w:val="24"/>
+              <w:lang w:val="ru-RU"/>
+              <w:lang w:val="ru-RU"/>
+            </w:rPr>
+            <w:t>меняться?</w:t>
+          </w:r>
+        </w:hyperlink>
       </w:hyperlink>
     </w:p>
     <w:p>
@@ -1064,77 +1084,79 @@
           <w:lang w:val="ru-RU"/>
         </w:rPr>
       </w:pPr>
-      <w:hyperlink w:anchor="chapter_12">
-        <w:r>
-          <w:rPr>
-            <w:rFonts w:ascii="DejaVu Serif" w:hAnsi="DejaVu Serif"/>
-            <w:color w:val="000000"/>
-            <w:sz w:val="24"/>
-            <w:lang w:val="ru-RU"/>
-            <w:lang w:val="ru-RU"/>
-          </w:rPr>
-          <w:t xml:space="preserve">Глава </w:t>
-        </w:r>
-        <w:r>
-          <w:rPr>
-            <w:rFonts w:ascii="DejaVu Serif" w:hAnsi="DejaVu Serif"/>
-            <w:color w:val="000000"/>
-            <w:sz w:val="24"/>
-            <w:lang w:val="ru-RU"/>
-            <w:lang w:val="ru-RU"/>
-          </w:rPr>
-          <w:t xml:space="preserve">12. </w:t>
-        </w:r>
-        <w:r>
-          <w:rPr>
-            <w:rFonts w:ascii="DejaVu Serif" w:hAnsi="DejaVu Serif"/>
-            <w:color w:val="000000"/>
-            <w:sz w:val="24"/>
-            <w:lang w:val="ru-RU"/>
-            <w:lang w:val="ru-RU"/>
-          </w:rPr>
-          <w:t xml:space="preserve">От </w:t>
-        </w:r>
-        <w:r>
-          <w:rPr>
-            <w:rFonts w:ascii="DejaVu Serif" w:hAnsi="DejaVu Serif"/>
-            <w:color w:val="000000"/>
-            <w:sz w:val="24"/>
-            <w:lang w:val="ru-RU"/>
-            <w:lang w:val="ru-RU"/>
-          </w:rPr>
-          <w:t xml:space="preserve">единомышленников </w:t>
-        </w:r>
-        <w:r>
-          <w:rPr>
-            <w:rFonts w:ascii="DejaVu Serif" w:hAnsi="DejaVu Serif"/>
-            <w:color w:val="000000"/>
-            <w:sz w:val="24"/>
-            <w:lang w:val="ru-RU"/>
-            <w:lang w:val="ru-RU"/>
-          </w:rPr>
-          <w:t xml:space="preserve">к </w:t>
-        </w:r>
-        <w:r>
-          <w:rPr>
-            <w:rFonts w:ascii="DejaVu Serif" w:hAnsi="DejaVu Serif"/>
-            <w:color w:val="000000"/>
-            <w:sz w:val="24"/>
-            <w:lang w:val="ru-RU"/>
-            <w:lang w:val="ru-RU"/>
-          </w:rPr>
-          <w:t xml:space="preserve">соборному </w:t>
-        </w:r>
-        <w:r>
-          <w:rPr>
-            <w:rFonts w:ascii="DejaVu Serif" w:hAnsi="DejaVu Serif"/>
-            <w:color w:val="000000"/>
-            <w:sz w:val="24"/>
-            <w:lang w:val="ru-RU"/>
-            <w:lang w:val="ru-RU"/>
-          </w:rPr>
-          <w:t>обществу</w:t>
-        </w:r>
+      <w:hyperlink w:anchor="chapter_11" w:history="1">
+        <w:hyperlink w:anchor="chapter_12">
+          <w:r>
+            <w:rPr>
+              <w:rFonts w:ascii="DejaVu Serif" w:hAnsi="DejaVu Serif"/>
+              <w:color w:val="000000"/>
+              <w:sz w:val="24"/>
+              <w:lang w:val="ru-RU"/>
+              <w:lang w:val="ru-RU"/>
+            </w:rPr>
+            <w:t xml:space="preserve">Глава </w:t>
+          </w:r>
+          <w:r>
+            <w:rPr>
+              <w:rFonts w:ascii="DejaVu Serif" w:hAnsi="DejaVu Serif"/>
+              <w:color w:val="000000"/>
+              <w:sz w:val="24"/>
+              <w:lang w:val="ru-RU"/>
+              <w:lang w:val="ru-RU"/>
+            </w:rPr>
+            <w:t xml:space="preserve">11. </w:t>
+          </w:r>
+          <w:r>
+            <w:rPr>
+              <w:rFonts w:ascii="DejaVu Serif" w:hAnsi="DejaVu Serif"/>
+              <w:color w:val="000000"/>
+              <w:sz w:val="24"/>
+              <w:lang w:val="ru-RU"/>
+              <w:lang w:val="ru-RU"/>
+            </w:rPr>
+            <w:t xml:space="preserve">От </w:t>
+          </w:r>
+          <w:r>
+            <w:rPr>
+              <w:rFonts w:ascii="DejaVu Serif" w:hAnsi="DejaVu Serif"/>
+              <w:color w:val="000000"/>
+              <w:sz w:val="24"/>
+              <w:lang w:val="ru-RU"/>
+              <w:lang w:val="ru-RU"/>
+            </w:rPr>
+            <w:t xml:space="preserve">единомышленников </w:t>
+          </w:r>
+          <w:r>
+            <w:rPr>
+              <w:rFonts w:ascii="DejaVu Serif" w:hAnsi="DejaVu Serif"/>
+              <w:color w:val="000000"/>
+              <w:sz w:val="24"/>
+              <w:lang w:val="ru-RU"/>
+              <w:lang w:val="ru-RU"/>
+            </w:rPr>
+            <w:t xml:space="preserve">к </w:t>
+          </w:r>
+          <w:r>
+            <w:rPr>
+              <w:rFonts w:ascii="DejaVu Serif" w:hAnsi="DejaVu Serif"/>
+              <w:color w:val="000000"/>
+              <w:sz w:val="24"/>
+              <w:lang w:val="ru-RU"/>
+              <w:lang w:val="ru-RU"/>
+            </w:rPr>
+            <w:t xml:space="preserve">соборному </w:t>
+          </w:r>
+          <w:r>
+            <w:rPr>
+              <w:rFonts w:ascii="DejaVu Serif" w:hAnsi="DejaVu Serif"/>
+              <w:color w:val="000000"/>
+              <w:sz w:val="24"/>
+              <w:lang w:val="ru-RU"/>
+              <w:lang w:val="ru-RU"/>
+            </w:rPr>
+            <w:t>обществу</w:t>
+          </w:r>
+        </w:hyperlink>
       </w:hyperlink>
     </w:p>
     <w:p>
@@ -1150,87 +1172,89 @@
           <w:lang w:val="ru-RU"/>
         </w:rPr>
       </w:pPr>
-      <w:hyperlink w:anchor="chapter_13">
-        <w:r>
-          <w:rPr>
-            <w:rFonts w:ascii="DejaVu Serif" w:hAnsi="DejaVu Serif"/>
-            <w:color w:val="000000"/>
-            <w:sz w:val="24"/>
-            <w:lang w:val="ru-RU"/>
-            <w:lang w:val="ru-RU"/>
-          </w:rPr>
-          <w:t xml:space="preserve">Глава </w:t>
-        </w:r>
-        <w:r>
-          <w:rPr>
-            <w:rFonts w:ascii="DejaVu Serif" w:hAnsi="DejaVu Serif"/>
-            <w:color w:val="000000"/>
-            <w:sz w:val="24"/>
-            <w:lang w:val="ru-RU"/>
-            <w:lang w:val="ru-RU"/>
-          </w:rPr>
-          <w:t xml:space="preserve">13. </w:t>
-        </w:r>
-        <w:r>
-          <w:rPr>
-            <w:rFonts w:ascii="DejaVu Serif" w:hAnsi="DejaVu Serif"/>
-            <w:color w:val="000000"/>
-            <w:sz w:val="24"/>
-            <w:lang w:val="ru-RU"/>
-            <w:lang w:val="ru-RU"/>
-          </w:rPr>
-          <w:t xml:space="preserve">Переходный </w:t>
-        </w:r>
-        <w:r>
-          <w:rPr>
-            <w:rFonts w:ascii="DejaVu Serif" w:hAnsi="DejaVu Serif"/>
-            <w:color w:val="000000"/>
-            <w:sz w:val="24"/>
-            <w:lang w:val="ru-RU"/>
-            <w:lang w:val="ru-RU"/>
-          </w:rPr>
-          <w:t xml:space="preserve">период: </w:t>
-        </w:r>
-        <w:r>
-          <w:rPr>
-            <w:rFonts w:ascii="DejaVu Serif" w:hAnsi="DejaVu Serif"/>
-            <w:color w:val="000000"/>
-            <w:sz w:val="24"/>
-            <w:lang w:val="ru-RU"/>
-            <w:lang w:val="ru-RU"/>
-          </w:rPr>
-          <w:t xml:space="preserve">ошибки, </w:t>
-        </w:r>
-        <w:r>
-          <w:rPr>
-            <w:rFonts w:ascii="DejaVu Serif" w:hAnsi="DejaVu Serif"/>
-            <w:color w:val="000000"/>
-            <w:sz w:val="24"/>
-            <w:lang w:val="ru-RU"/>
-            <w:lang w:val="ru-RU"/>
-          </w:rPr>
-          <w:t xml:space="preserve">испытания </w:t>
-        </w:r>
-        <w:r>
-          <w:rPr>
-            <w:rFonts w:ascii="DejaVu Serif" w:hAnsi="DejaVu Serif"/>
-            <w:color w:val="000000"/>
-            <w:sz w:val="24"/>
-            <w:lang w:val="ru-RU"/>
-            <w:lang w:val="ru-RU"/>
-          </w:rPr>
-          <w:t xml:space="preserve">и </w:t>
-        </w:r>
-        <w:r>
-          <w:rPr>
-            <w:rFonts w:ascii="DejaVu Serif" w:hAnsi="DejaVu Serif"/>
-            <w:color w:val="000000"/>
-            <w:sz w:val="24"/>
-            <w:lang w:val="ru-RU"/>
-            <w:lang w:val="ru-RU"/>
-          </w:rPr>
-          <w:t>исправления</w:t>
-        </w:r>
+      <w:hyperlink w:anchor="chapter_12" w:history="1">
+        <w:hyperlink w:anchor="chapter_13">
+          <w:r>
+            <w:rPr>
+              <w:rFonts w:ascii="DejaVu Serif" w:hAnsi="DejaVu Serif"/>
+              <w:color w:val="000000"/>
+              <w:sz w:val="24"/>
+              <w:lang w:val="ru-RU"/>
+              <w:lang w:val="ru-RU"/>
+            </w:rPr>
+            <w:t xml:space="preserve">Глава </w:t>
+          </w:r>
+          <w:r>
+            <w:rPr>
+              <w:rFonts w:ascii="DejaVu Serif" w:hAnsi="DejaVu Serif"/>
+              <w:color w:val="000000"/>
+              <w:sz w:val="24"/>
+              <w:lang w:val="ru-RU"/>
+              <w:lang w:val="ru-RU"/>
+            </w:rPr>
+            <w:t xml:space="preserve">12. </w:t>
+          </w:r>
+          <w:r>
+            <w:rPr>
+              <w:rFonts w:ascii="DejaVu Serif" w:hAnsi="DejaVu Serif"/>
+              <w:color w:val="000000"/>
+              <w:sz w:val="24"/>
+              <w:lang w:val="ru-RU"/>
+              <w:lang w:val="ru-RU"/>
+            </w:rPr>
+            <w:t xml:space="preserve">Переходный </w:t>
+          </w:r>
+          <w:r>
+            <w:rPr>
+              <w:rFonts w:ascii="DejaVu Serif" w:hAnsi="DejaVu Serif"/>
+              <w:color w:val="000000"/>
+              <w:sz w:val="24"/>
+              <w:lang w:val="ru-RU"/>
+              <w:lang w:val="ru-RU"/>
+            </w:rPr>
+            <w:t xml:space="preserve">период: </w:t>
+          </w:r>
+          <w:r>
+            <w:rPr>
+              <w:rFonts w:ascii="DejaVu Serif" w:hAnsi="DejaVu Serif"/>
+              <w:color w:val="000000"/>
+              <w:sz w:val="24"/>
+              <w:lang w:val="ru-RU"/>
+              <w:lang w:val="ru-RU"/>
+            </w:rPr>
+            <w:t xml:space="preserve">ошибки, </w:t>
+          </w:r>
+          <w:r>
+            <w:rPr>
+              <w:rFonts w:ascii="DejaVu Serif" w:hAnsi="DejaVu Serif"/>
+              <w:color w:val="000000"/>
+              <w:sz w:val="24"/>
+              <w:lang w:val="ru-RU"/>
+              <w:lang w:val="ru-RU"/>
+            </w:rPr>
+            <w:t xml:space="preserve">испытания </w:t>
+          </w:r>
+          <w:r>
+            <w:rPr>
+              <w:rFonts w:ascii="DejaVu Serif" w:hAnsi="DejaVu Serif"/>
+              <w:color w:val="000000"/>
+              <w:sz w:val="24"/>
+              <w:lang w:val="ru-RU"/>
+              <w:lang w:val="ru-RU"/>
+            </w:rPr>
+            <w:t xml:space="preserve">и </w:t>
+          </w:r>
+          <w:r>
+            <w:rPr>
+              <w:rFonts w:ascii="DejaVu Serif" w:hAnsi="DejaVu Serif"/>
+              <w:color w:val="000000"/>
+              <w:sz w:val="24"/>
+              <w:lang w:val="ru-RU"/>
+              <w:lang w:val="ru-RU"/>
+            </w:rPr>
+            <w:t>исправления</w:t>
+          </w:r>
+        </w:hyperlink>
       </w:hyperlink>
     </w:p>
     <w:p>
@@ -1246,97 +1270,99 @@
           <w:lang w:val="ru-RU"/>
         </w:rPr>
       </w:pPr>
-      <w:hyperlink w:anchor="chapter_14">
-        <w:r>
-          <w:rPr>
-            <w:rFonts w:ascii="DejaVu Serif" w:hAnsi="DejaVu Serif"/>
-            <w:color w:val="000000"/>
-            <w:sz w:val="24"/>
-            <w:lang w:val="ru-RU"/>
-            <w:lang w:val="ru-RU"/>
-          </w:rPr>
-          <w:t xml:space="preserve">Глава </w:t>
-        </w:r>
-        <w:r>
-          <w:rPr>
-            <w:rFonts w:ascii="DejaVu Serif" w:hAnsi="DejaVu Serif"/>
-            <w:color w:val="000000"/>
-            <w:sz w:val="24"/>
-            <w:lang w:val="ru-RU"/>
-            <w:lang w:val="ru-RU"/>
-          </w:rPr>
-          <w:t xml:space="preserve">14. </w:t>
-        </w:r>
-        <w:r>
-          <w:rPr>
-            <w:rFonts w:ascii="DejaVu Serif" w:hAnsi="DejaVu Serif"/>
-            <w:color w:val="000000"/>
-            <w:sz w:val="24"/>
-            <w:lang w:val="ru-RU"/>
-            <w:lang w:val="ru-RU"/>
-          </w:rPr>
-          <w:t xml:space="preserve">Свобода </w:t>
-        </w:r>
-        <w:r>
-          <w:rPr>
-            <w:rFonts w:ascii="DejaVu Serif" w:hAnsi="DejaVu Serif"/>
-            <w:color w:val="000000"/>
-            <w:sz w:val="24"/>
-            <w:lang w:val="ru-RU"/>
-            <w:lang w:val="ru-RU"/>
-          </w:rPr>
-          <w:t xml:space="preserve">человека </w:t>
-        </w:r>
-        <w:r>
-          <w:rPr>
-            <w:rFonts w:ascii="DejaVu Serif" w:hAnsi="DejaVu Serif"/>
-            <w:color w:val="000000"/>
-            <w:sz w:val="24"/>
-            <w:lang w:val="ru-RU"/>
-            <w:lang w:val="ru-RU"/>
-          </w:rPr>
-          <w:t xml:space="preserve">перед </w:t>
-        </w:r>
-        <w:r>
-          <w:rPr>
-            <w:rFonts w:ascii="DejaVu Serif" w:hAnsi="DejaVu Serif"/>
-            <w:color w:val="000000"/>
-            <w:sz w:val="24"/>
-            <w:lang w:val="ru-RU"/>
-            <w:lang w:val="ru-RU"/>
-          </w:rPr>
-          <w:t xml:space="preserve">Богом </w:t>
-        </w:r>
-        <w:r>
-          <w:rPr>
-            <w:rFonts w:ascii="DejaVu Serif" w:hAnsi="DejaVu Serif"/>
-            <w:color w:val="000000"/>
-            <w:sz w:val="24"/>
-            <w:lang w:val="ru-RU"/>
-            <w:lang w:val="ru-RU"/>
-          </w:rPr>
-          <w:t xml:space="preserve">и </w:t>
-        </w:r>
-        <w:r>
-          <w:rPr>
-            <w:rFonts w:ascii="DejaVu Serif" w:hAnsi="DejaVu Serif"/>
-            <w:color w:val="000000"/>
-            <w:sz w:val="24"/>
-            <w:lang w:val="ru-RU"/>
-            <w:lang w:val="ru-RU"/>
-          </w:rPr>
-          <w:t xml:space="preserve">начало </w:t>
-        </w:r>
-        <w:r>
-          <w:rPr>
-            <w:rFonts w:ascii="DejaVu Serif" w:hAnsi="DejaVu Serif"/>
-            <w:color w:val="000000"/>
-            <w:sz w:val="24"/>
-            <w:lang w:val="ru-RU"/>
-            <w:lang w:val="ru-RU"/>
-          </w:rPr>
-          <w:t>суда</w:t>
-        </w:r>
+      <w:hyperlink w:anchor="chapter_13" w:history="1">
+        <w:hyperlink w:anchor="chapter_14">
+          <w:r>
+            <w:rPr>
+              <w:rFonts w:ascii="DejaVu Serif" w:hAnsi="DejaVu Serif"/>
+              <w:color w:val="000000"/>
+              <w:sz w:val="24"/>
+              <w:lang w:val="ru-RU"/>
+              <w:lang w:val="ru-RU"/>
+            </w:rPr>
+            <w:t xml:space="preserve">Глава </w:t>
+          </w:r>
+          <w:r>
+            <w:rPr>
+              <w:rFonts w:ascii="DejaVu Serif" w:hAnsi="DejaVu Serif"/>
+              <w:color w:val="000000"/>
+              <w:sz w:val="24"/>
+              <w:lang w:val="ru-RU"/>
+              <w:lang w:val="ru-RU"/>
+            </w:rPr>
+            <w:t xml:space="preserve">13. </w:t>
+          </w:r>
+          <w:r>
+            <w:rPr>
+              <w:rFonts w:ascii="DejaVu Serif" w:hAnsi="DejaVu Serif"/>
+              <w:color w:val="000000"/>
+              <w:sz w:val="24"/>
+              <w:lang w:val="ru-RU"/>
+              <w:lang w:val="ru-RU"/>
+            </w:rPr>
+            <w:t xml:space="preserve">Свобода </w:t>
+          </w:r>
+          <w:r>
+            <w:rPr>
+              <w:rFonts w:ascii="DejaVu Serif" w:hAnsi="DejaVu Serif"/>
+              <w:color w:val="000000"/>
+              <w:sz w:val="24"/>
+              <w:lang w:val="ru-RU"/>
+              <w:lang w:val="ru-RU"/>
+            </w:rPr>
+            <w:t xml:space="preserve">человека </w:t>
+          </w:r>
+          <w:r>
+            <w:rPr>
+              <w:rFonts w:ascii="DejaVu Serif" w:hAnsi="DejaVu Serif"/>
+              <w:color w:val="000000"/>
+              <w:sz w:val="24"/>
+              <w:lang w:val="ru-RU"/>
+              <w:lang w:val="ru-RU"/>
+            </w:rPr>
+            <w:t xml:space="preserve">перед </w:t>
+          </w:r>
+          <w:r>
+            <w:rPr>
+              <w:rFonts w:ascii="DejaVu Serif" w:hAnsi="DejaVu Serif"/>
+              <w:color w:val="000000"/>
+              <w:sz w:val="24"/>
+              <w:lang w:val="ru-RU"/>
+              <w:lang w:val="ru-RU"/>
+            </w:rPr>
+            <w:t xml:space="preserve">Богом </w:t>
+          </w:r>
+          <w:r>
+            <w:rPr>
+              <w:rFonts w:ascii="DejaVu Serif" w:hAnsi="DejaVu Serif"/>
+              <w:color w:val="000000"/>
+              <w:sz w:val="24"/>
+              <w:lang w:val="ru-RU"/>
+              <w:lang w:val="ru-RU"/>
+            </w:rPr>
+            <w:t xml:space="preserve">и </w:t>
+          </w:r>
+          <w:r>
+            <w:rPr>
+              <w:rFonts w:ascii="DejaVu Serif" w:hAnsi="DejaVu Serif"/>
+              <w:color w:val="000000"/>
+              <w:sz w:val="24"/>
+              <w:lang w:val="ru-RU"/>
+              <w:lang w:val="ru-RU"/>
+            </w:rPr>
+            <w:t xml:space="preserve">начало </w:t>
+          </w:r>
+          <w:r>
+            <w:rPr>
+              <w:rFonts w:ascii="DejaVu Serif" w:hAnsi="DejaVu Serif"/>
+              <w:color w:val="000000"/>
+              <w:sz w:val="24"/>
+              <w:lang w:val="ru-RU"/>
+              <w:lang w:val="ru-RU"/>
+            </w:rPr>
+            <w:t>суда</w:t>
+          </w:r>
+        </w:hyperlink>
       </w:hyperlink>
     </w:p>
     <w:p>
@@ -1352,67 +1378,69 @@
           <w:lang w:val="ru-RU"/>
         </w:rPr>
       </w:pPr>
-      <w:hyperlink w:anchor="chapter_18">
-        <w:r>
-          <w:rPr>
-            <w:rFonts w:ascii="DejaVu Serif" w:hAnsi="DejaVu Serif"/>
-            <w:color w:val="000000"/>
-            <w:sz w:val="24"/>
-            <w:lang w:val="ru-RU"/>
-            <w:lang w:val="ru-RU"/>
-          </w:rPr>
-          <w:t xml:space="preserve">Глава </w:t>
-        </w:r>
-        <w:r>
-          <w:rPr>
-            <w:rFonts w:ascii="DejaVu Serif" w:hAnsi="DejaVu Serif"/>
-            <w:color w:val="000000"/>
-            <w:sz w:val="24"/>
-            <w:lang w:val="ru-RU"/>
-            <w:lang w:val="ru-RU"/>
-          </w:rPr>
-          <w:t xml:space="preserve">18. </w:t>
-        </w:r>
-        <w:r>
-          <w:rPr>
-            <w:rFonts w:ascii="DejaVu Serif" w:hAnsi="DejaVu Serif"/>
-            <w:color w:val="000000"/>
-            <w:sz w:val="24"/>
-            <w:lang w:val="ru-RU"/>
-            <w:lang w:val="ru-RU"/>
-          </w:rPr>
-          <w:t xml:space="preserve">Будущее </w:t>
-        </w:r>
-        <w:r>
-          <w:rPr>
-            <w:rFonts w:ascii="DejaVu Serif" w:hAnsi="DejaVu Serif"/>
-            <w:color w:val="000000"/>
-            <w:sz w:val="24"/>
-            <w:lang w:val="ru-RU"/>
-            <w:lang w:val="ru-RU"/>
-          </w:rPr>
-          <w:t xml:space="preserve">начинается </w:t>
-        </w:r>
-        <w:r>
-          <w:rPr>
-            <w:rFonts w:ascii="DejaVu Serif" w:hAnsi="DejaVu Serif"/>
-            <w:color w:val="000000"/>
-            <w:sz w:val="24"/>
-            <w:lang w:val="ru-RU"/>
-            <w:lang w:val="ru-RU"/>
-          </w:rPr>
-          <w:t xml:space="preserve">с </w:t>
-        </w:r>
-        <w:r>
-          <w:rPr>
-            <w:rFonts w:ascii="DejaVu Serif" w:hAnsi="DejaVu Serif"/>
-            <w:color w:val="000000"/>
-            <w:sz w:val="24"/>
-            <w:lang w:val="ru-RU"/>
-            <w:lang w:val="ru-RU"/>
-          </w:rPr>
-          <w:t>тебя</w:t>
-        </w:r>
+      <w:hyperlink w:anchor="chapter_14" w:history="1">
+        <w:hyperlink w:anchor="chapter_18">
+          <w:r>
+            <w:rPr>
+              <w:rFonts w:ascii="DejaVu Serif" w:hAnsi="DejaVu Serif"/>
+              <w:color w:val="000000"/>
+              <w:sz w:val="24"/>
+              <w:lang w:val="ru-RU"/>
+              <w:lang w:val="ru-RU"/>
+            </w:rPr>
+            <w:t xml:space="preserve">Глава </w:t>
+          </w:r>
+          <w:r>
+            <w:rPr>
+              <w:rFonts w:ascii="DejaVu Serif" w:hAnsi="DejaVu Serif"/>
+              <w:color w:val="000000"/>
+              <w:sz w:val="24"/>
+              <w:lang w:val="ru-RU"/>
+              <w:lang w:val="ru-RU"/>
+            </w:rPr>
+            <w:t xml:space="preserve">14. </w:t>
+          </w:r>
+          <w:r>
+            <w:rPr>
+              <w:rFonts w:ascii="DejaVu Serif" w:hAnsi="DejaVu Serif"/>
+              <w:color w:val="000000"/>
+              <w:sz w:val="24"/>
+              <w:lang w:val="ru-RU"/>
+              <w:lang w:val="ru-RU"/>
+            </w:rPr>
+            <w:t xml:space="preserve">Будущее </w:t>
+          </w:r>
+          <w:r>
+            <w:rPr>
+              <w:rFonts w:ascii="DejaVu Serif" w:hAnsi="DejaVu Serif"/>
+              <w:color w:val="000000"/>
+              <w:sz w:val="24"/>
+              <w:lang w:val="ru-RU"/>
+              <w:lang w:val="ru-RU"/>
+            </w:rPr>
+            <w:t xml:space="preserve">начинается </w:t>
+          </w:r>
+          <w:r>
+            <w:rPr>
+              <w:rFonts w:ascii="DejaVu Serif" w:hAnsi="DejaVu Serif"/>
+              <w:color w:val="000000"/>
+              <w:sz w:val="24"/>
+              <w:lang w:val="ru-RU"/>
+              <w:lang w:val="ru-RU"/>
+            </w:rPr>
+            <w:t xml:space="preserve">с </w:t>
+          </w:r>
+          <w:r>
+            <w:rPr>
+              <w:rFonts w:ascii="DejaVu Serif" w:hAnsi="DejaVu Serif"/>
+              <w:color w:val="000000"/>
+              <w:sz w:val="24"/>
+              <w:lang w:val="ru-RU"/>
+              <w:lang w:val="ru-RU"/>
+            </w:rPr>
+            <w:t>тебя</w:t>
+          </w:r>
+        </w:hyperlink>
       </w:hyperlink>
     </w:p>
     <w:p>
@@ -1762,6 +1790,7 @@
     </w:p>
     <w:p>
       <w:bookmarkStart w:id="31" w:name="chapter_1"/>
+      <w:bookmarkStart w:id="1001" w:name="chapter_1"/>
       <w:pPr>
         <w:pStyle w:val="Heading1"/>
         <w:keepNext/>
@@ -1785,6 +1814,7 @@
         <w:t>Глава 1. В какой стране будут жить наши дети?</w:t>
       </w:r>
       <w:bookmarkEnd w:id="31"/>
+      <w:bookmarkEnd w:id="1001"/>
     </w:p>
     <w:p>
       <w:pPr>
@@ -3035,6 +3065,7 @@
     </w:p>
     <w:p>
       <w:bookmarkStart w:id="97" w:name="chapter_2"/>
+      <w:bookmarkStart w:id="1002" w:name="chapter_2"/>
       <w:pPr>
         <w:pStyle w:val="Heading1"/>
         <w:keepNext/>
@@ -3058,6 +3089,7 @@
         <w:t>Глава 2. Бог, любовь и справедливость</w:t>
       </w:r>
       <w:bookmarkEnd w:id="97"/>
+      <w:bookmarkEnd w:id="1002"/>
     </w:p>
     <w:p>
       <w:pPr>
@@ -5468,6 +5500,7 @@
     </w:p>
     <w:p>
       <w:bookmarkStart w:id="223" w:name="chapter_3"/>
+      <w:bookmarkStart w:id="1003" w:name="chapter_3"/>
       <w:pPr>
         <w:pStyle w:val="Heading1"/>
         <w:keepNext/>
@@ -5491,6 +5524,7 @@
         <w:t>Глава 3. Новый человек и общество любви</w:t>
       </w:r>
       <w:bookmarkEnd w:id="223"/>
+      <w:bookmarkEnd w:id="1003"/>
     </w:p>
     <w:p>
       <w:pPr>
@@ -6164,6 +6198,7 @@
     </w:p>
     <w:p>
       <w:bookmarkStart w:id="258" w:name="chapter_4"/>
+      <w:bookmarkStart w:id="1004" w:name="chapter_4"/>
       <w:pPr>
         <w:pStyle w:val="Heading1"/>
         <w:keepNext/>
@@ -6187,6 +6222,7 @@
         <w:t>Глава 4. Церковь, соборность и государственное управление</w:t>
       </w:r>
       <w:bookmarkEnd w:id="258"/>
+      <w:bookmarkEnd w:id="1004"/>
     </w:p>
     <w:p>
       <w:pPr>
@@ -7153,6 +7189,7 @@
     </w:p>
     <w:p>
       <w:bookmarkStart w:id="308" w:name="chapter_5"/>
+      <w:bookmarkStart w:id="1005" w:name="chapter_5"/>
       <w:pPr>
         <w:pStyle w:val="Heading1"/>
         <w:keepNext/>
@@ -7176,6 +7213,7 @@
         <w:t>Глава 5. Соборное хозяйствование: общество без денег</w:t>
       </w:r>
       <w:bookmarkEnd w:id="308"/>
+      <w:bookmarkEnd w:id="1005"/>
     </w:p>
     <w:p>
       <w:pPr>
@@ -7693,6 +7731,7 @@
     </w:p>
     <w:p>
       <w:bookmarkStart w:id="335" w:name="chapter_6"/>
+      <w:bookmarkStart w:id="1006" w:name="chapter_6"/>
       <w:pPr>
         <w:pStyle w:val="Heading1"/>
         <w:keepNext/>
@@ -7716,6 +7755,7 @@
         <w:t>Глава 6. Труд, обеспечение потребностей и забота о человеке</w:t>
       </w:r>
       <w:bookmarkEnd w:id="335"/>
+      <w:bookmarkEnd w:id="1006"/>
     </w:p>
     <w:p>
       <w:pPr>
@@ -8473,6 +8513,7 @@
     </w:p>
     <w:p>
       <w:bookmarkStart w:id="374" w:name="chapter_7"/>
+      <w:bookmarkStart w:id="1007" w:name="chapter_7"/>
       <w:pPr>
         <w:pStyle w:val="Heading1"/>
         <w:keepNext/>
@@ -8496,6 +8537,7 @@
         <w:t>Глава 7. Семья, дети и воспитание в новом обществе</w:t>
       </w:r>
       <w:bookmarkEnd w:id="374"/>
+      <w:bookmarkEnd w:id="1007"/>
     </w:p>
     <w:p>
       <w:pPr>
@@ -10064,6 +10106,7 @@
     </w:p>
     <w:p>
       <w:bookmarkStart w:id="454" w:name="chapter_9"/>
+      <w:bookmarkStart w:id="1008" w:name="chapter_8"/>
       <w:pPr>
         <w:pStyle w:val="Heading1"/>
         <w:keepNext/>
@@ -10084,9 +10127,10 @@
           <w:sz w:val="32"/>
           <w:lang w:val="ru-RU"/>
         </w:rPr>
-        <w:t>Глава 9. Свобода, церковный суд и защита человека</w:t>
+        <w:t>Глава 8. Свобода, церковный суд и защита человека</w:t>
       </w:r>
       <w:bookmarkEnd w:id="454"/>
+      <w:bookmarkEnd w:id="1008"/>
     </w:p>
     <w:p>
       <w:pPr>
@@ -10574,6 +10618,7 @@
     </w:p>
     <w:p>
       <w:bookmarkStart w:id="479" w:name="chapter_10"/>
+      <w:bookmarkStart w:id="1009" w:name="chapter_9"/>
       <w:pPr>
         <w:pStyle w:val="Heading1"/>
         <w:keepNext/>
@@ -10594,9 +10639,10 @@
           <w:sz w:val="32"/>
           <w:lang w:val="ru-RU"/>
         </w:rPr>
-        <w:t>Глава 10. Безопасность и отношения с другими государствами</w:t>
+        <w:t>Глава 9. Безопасность и отношения с другими государствами</w:t>
       </w:r>
       <w:bookmarkEnd w:id="479"/>
+      <w:bookmarkEnd w:id="1009"/>
     </w:p>
     <w:p>
       <w:pPr>
@@ -10867,6 +10913,7 @@
     </w:p>
     <w:p>
       <w:bookmarkStart w:id="493" w:name="chapter_11"/>
+      <w:bookmarkStart w:id="1010" w:name="chapter_10"/>
       <w:pPr>
         <w:pStyle w:val="Heading1"/>
         <w:keepNext/>
@@ -10887,9 +10934,10 @@
           <w:sz w:val="32"/>
           <w:lang w:val="ru-RU"/>
         </w:rPr>
-        <w:t>Глава 11. Для чего живёт человек и зачем ему меняться?</w:t>
+        <w:t>Глава 10. Для чего живёт человек и зачем ему меняться?</w:t>
       </w:r>
       <w:bookmarkEnd w:id="493"/>
+      <w:bookmarkEnd w:id="1010"/>
     </w:p>
     <w:p>
       <w:pPr>
@@ -11864,6 +11912,7 @@
     </w:p>
     <w:p>
       <w:bookmarkStart w:id="543" w:name="chapter_12"/>
+      <w:bookmarkStart w:id="1011" w:name="chapter_11"/>
       <w:pPr>
         <w:pStyle w:val="Heading1"/>
         <w:keepNext/>
@@ -11884,9 +11933,10 @@
           <w:sz w:val="32"/>
           <w:lang w:val="ru-RU"/>
         </w:rPr>
-        <w:t>Глава 12. От единомышленников к соборному обществу</w:t>
+        <w:t>Глава 11. От единомышленников к соборному обществу</w:t>
       </w:r>
       <w:bookmarkEnd w:id="543"/>
+      <w:bookmarkEnd w:id="1011"/>
     </w:p>
     <w:p>
       <w:pPr>
@@ -12678,6 +12728,7 @@
     </w:p>
     <w:p>
       <w:bookmarkStart w:id="584" w:name="chapter_13"/>
+      <w:bookmarkStart w:id="1012" w:name="chapter_12"/>
       <w:pPr>
         <w:pStyle w:val="Heading1"/>
         <w:keepNext/>
@@ -12698,9 +12749,10 @@
           <w:sz w:val="32"/>
           <w:lang w:val="ru-RU"/>
         </w:rPr>
-        <w:t>Глава 13. Переходный период: ошибки, испытания и исправления</w:t>
+        <w:t>Глава 12. Переходный период: ошибки, испытания и исправления</w:t>
       </w:r>
       <w:bookmarkEnd w:id="584"/>
+      <w:bookmarkEnd w:id="1012"/>
     </w:p>
     <w:p>
       <w:pPr>
@@ -13477,6 +13529,7 @@
     </w:p>
     <w:p>
       <w:bookmarkStart w:id="624" w:name="chapter_14"/>
+      <w:bookmarkStart w:id="1013" w:name="chapter_13"/>
       <w:pPr>
         <w:pStyle w:val="Heading1"/>
         <w:keepNext/>
@@ -13497,9 +13550,10 @@
           <w:sz w:val="32"/>
           <w:lang w:val="ru-RU"/>
         </w:rPr>
-        <w:t>Глава 14. Свобода человека перед Богом и начало суда</w:t>
+        <w:t>Глава 13. Свобода человека перед Богом и начало суда</w:t>
       </w:r>
       <w:bookmarkEnd w:id="624"/>
+      <w:bookmarkEnd w:id="1013"/>
     </w:p>
     <w:p>
       <w:pPr>
@@ -14055,6 +14109,7 @@
     </w:p>
     <w:p>
       <w:bookmarkStart w:id="653" w:name="chapter_18"/>
+      <w:bookmarkStart w:id="1014" w:name="chapter_14"/>
       <w:pPr>
         <w:pStyle w:val="Heading1"/>
         <w:keepNext/>
@@ -14075,9 +14130,10 @@
           <w:sz w:val="32"/>
           <w:lang w:val="ru-RU"/>
         </w:rPr>
-        <w:t>Глава 18. Будущее начинается с тебя</w:t>
+        <w:t>Глава 14. Будущее начинается с тебя</w:t>
       </w:r>
       <w:bookmarkEnd w:id="653"/>
+      <w:bookmarkEnd w:id="1014"/>
     </w:p>
     <w:p>
       <w:pPr>

</xml_diff>